<commit_message>
docs(outputs): ecuaciones de la nota Word renderizadas en Computer Modern (LaTeX)
El editor OMML de Word y las ecuaciones en texto plano no daban calidad
suficiente. Ahora render_eqs.py renderiza cada ecuacion con mathtext 'cm'
(Computer Modern, identico a LaTeX) a PNG 240 DPI transparente, y el
generador las incrusta como imagen centrada escalada a la caja de la
pagina. Texto en Calibri, sin saltos de pagina.

Co-Authored-By: Claude Sonnet 5 <noreply@anthropic.com>
</commit_message>
<xml_diff>
--- a/outputs/SVAR_Metodologia_Resultados_Accesible.docx
+++ b/outputs/SVAR_Metodologia_Resultados_Accesible.docx
@@ -1348,9 +1348,133 @@
     </w:p>
     <w:p>
       <w:pPr>
-        <w:spacing w:after="150" w:before="110"/>
+        <w:spacing w:after="170" w:before="140"/>
         <w:jc w:val="center"/>
       </w:pPr>
+      <w:r>
+        <w:drawing>
+          <wp:inline distT="0" distB="0" distL="0" distR="0">
+            <wp:extent cx="3724275" cy="1162050"/>
+            <wp:effectExtent t="0" r="0" b="0" l="0"/>
+            <wp:docPr id="1" name="" descr="" title=""/>
+            <wp:cNvGraphicFramePr>
+              <a:graphicFrameLocks xmlns:a="http://schemas.openxmlformats.org/drawingml/2006/main" noChangeAspect="1"/>
+            </wp:cNvGraphicFramePr>
+            <a:graphic xmlns:a="http://schemas.openxmlformats.org/drawingml/2006/main">
+              <a:graphicData uri="http://schemas.openxmlformats.org/drawingml/2006/picture">
+                <pic:pic xmlns:pic="http://schemas.openxmlformats.org/drawingml/2006/picture">
+                  <pic:nvPicPr>
+                    <pic:cNvPr id="0" name="" descr=""/>
+                    <pic:cNvPicPr>
+                      <a:picLocks noChangeAspect="1" noChangeArrowheads="1"/>
+                    </pic:cNvPicPr>
+                  </pic:nvPicPr>
+                  <pic:blipFill>
+                    <a:blip r:embed="rId8" cstate="none"/>
+                    <a:srcRect/>
+                    <a:stretch>
+                      <a:fillRect/>
+                    </a:stretch>
+                  </pic:blipFill>
+                  <pic:spPr bwMode="auto">
+                    <a:xfrm>
+                      <a:off x="0" y="0"/>
+                      <a:ext cx="3724275" cy="1162050"/>
+                    </a:xfrm>
+                    <a:prstGeom prst="rect">
+                      <a:avLst/>
+                    </a:prstGeom>
+                  </pic:spPr>
+                </pic:pic>
+              </a:graphicData>
+            </a:graphic>
+          </wp:inline>
+        </w:drawing>
+      </w:r>
+    </w:p>
+    <w:p>
+      <w:pPr>
+        <w:spacing w:after="140" w:line="300"/>
+        <w:ind w:firstLine="431"/>
+        <w:jc w:val="both"/>
+      </w:pPr>
+      <w:r>
+        <w:rPr>
+          <w:rFonts w:ascii="Calibri" w:cs="Calibri" w:eastAsia="Calibri" w:hAnsi="Calibri"/>
+          <w:b w:val="false"/>
+          <w:bCs w:val="false"/>
+          <w:i w:val="false"/>
+          <w:iCs w:val="false"/>
+          <w:sz w:val="22"/>
+          <w:szCs w:val="22"/>
+        </w:rPr>
+        <w:t xml:space="preserve">Esta condición no es directamente contrastable. Bohn (1998, 2007) propone una condición suficiente que sí lo es: si el resultado primario responde positivamente al stock de deuda rezagado, la restricción intertemporal se cumple de forma asintótica, sin necesidad de suponer una tasa de descuento ni de proyectar a infinito, y sin exigir estacionariedad de las series. La función de reacción fiscal, en su forma canónica, es:</w:t>
+      </w:r>
+    </w:p>
+    <w:p>
+      <w:pPr>
+        <w:spacing w:after="170" w:before="140"/>
+        <w:jc w:val="center"/>
+      </w:pPr>
+      <w:r>
+        <w:drawing>
+          <wp:inline distT="0" distB="0" distL="0" distR="0">
+            <wp:extent cx="5715000" cy="504825"/>
+            <wp:effectExtent t="0" r="0" b="0" l="0"/>
+            <wp:docPr id="1" name="" descr="" title=""/>
+            <wp:cNvGraphicFramePr>
+              <a:graphicFrameLocks xmlns:a="http://schemas.openxmlformats.org/drawingml/2006/main" noChangeAspect="1"/>
+            </wp:cNvGraphicFramePr>
+            <a:graphic xmlns:a="http://schemas.openxmlformats.org/drawingml/2006/main">
+              <a:graphicData uri="http://schemas.openxmlformats.org/drawingml/2006/picture">
+                <pic:pic xmlns:pic="http://schemas.openxmlformats.org/drawingml/2006/picture">
+                  <pic:nvPicPr>
+                    <pic:cNvPr id="0" name="" descr=""/>
+                    <pic:cNvPicPr>
+                      <a:picLocks noChangeAspect="1" noChangeArrowheads="1"/>
+                    </pic:cNvPicPr>
+                  </pic:nvPicPr>
+                  <pic:blipFill>
+                    <a:blip r:embed="rId9" cstate="none"/>
+                    <a:srcRect/>
+                    <a:stretch>
+                      <a:fillRect/>
+                    </a:stretch>
+                  </pic:blipFill>
+                  <pic:spPr bwMode="auto">
+                    <a:xfrm>
+                      <a:off x="0" y="0"/>
+                      <a:ext cx="5715000" cy="504825"/>
+                    </a:xfrm>
+                    <a:prstGeom prst="rect">
+                      <a:avLst/>
+                    </a:prstGeom>
+                  </pic:spPr>
+                </pic:pic>
+              </a:graphicData>
+            </a:graphic>
+          </wp:inline>
+        </w:drawing>
+      </w:r>
+    </w:p>
+    <w:p>
+      <w:pPr>
+        <w:spacing w:after="140" w:line="300"/>
+        <w:ind w:firstLine="431"/>
+        <w:jc w:val="both"/>
+      </w:pPr>
+      <w:r>
+        <w:rPr>
+          <w:rFonts w:ascii="Calibri" w:cs="Calibri" w:eastAsia="Calibri" w:hAnsi="Calibri"/>
+          <w:b w:val="false"/>
+          <w:bCs w:val="false"/>
+          <w:i w:val="false"/>
+          <w:iCs w:val="false"/>
+          <w:sz w:val="22"/>
+          <w:szCs w:val="22"/>
+        </w:rPr>
+        <w:t xml:space="preserve">La hipótesis de sostenibilidad exige </w:t>
+      </w:r>
       <w:r>
         <w:rPr>
           <w:rFonts w:ascii="Calibri" w:cs="Calibri" w:eastAsia="Calibri" w:hAnsi="Calibri"/>
@@ -1361,7 +1485,19 @@
           <w:sz w:val="22"/>
           <w:szCs w:val="22"/>
         </w:rPr>
-        <w:t xml:space="preserve">d</w:t>
+        <w:t xml:space="preserve">ρ &gt; 0</w:t>
+      </w:r>
+      <w:r>
+        <w:rPr>
+          <w:rFonts w:ascii="Calibri" w:cs="Calibri" w:eastAsia="Calibri" w:hAnsi="Calibri"/>
+          <w:b w:val="false"/>
+          <w:bCs w:val="false"/>
+          <w:i w:val="false"/>
+          <w:iCs w:val="false"/>
+          <w:sz w:val="22"/>
+          <w:szCs w:val="22"/>
+        </w:rPr>
+        <w:t xml:space="preserve"> con significatividad estadística. La proyección de trayectorias se apoya en la ecuación de movimiento de la ratio de deuda (Blanchard, 2019), donde el término </w:t>
       </w:r>
       <w:r>
         <w:rPr>
@@ -1372,9 +1508,8 @@
           <w:iCs/>
           <w:sz w:val="22"/>
           <w:szCs w:val="22"/>
-          <w:vertAlign w:val="subscript"/>
-        </w:rPr>
-        <w:t xml:space="preserve">t−1</w:t>
+        </w:rPr>
+        <w:t xml:space="preserve">(r − g)</w:t>
       </w:r>
       <w:r>
         <w:rPr>
@@ -1386,8 +1521,61 @@
           <w:sz w:val="22"/>
           <w:szCs w:val="22"/>
         </w:rPr>
-        <w:t xml:space="preserve">  =  </w:t>
-      </w:r>
+        <w:t xml:space="preserve"> gobierna el efecto de bola de nieve:</w:t>
+      </w:r>
+    </w:p>
+    <w:p>
+      <w:pPr>
+        <w:spacing w:after="170" w:before="140"/>
+        <w:jc w:val="center"/>
+      </w:pPr>
+      <w:r>
+        <w:drawing>
+          <wp:inline distT="0" distB="0" distL="0" distR="0">
+            <wp:extent cx="4143375" cy="895350"/>
+            <wp:effectExtent t="0" r="0" b="0" l="0"/>
+            <wp:docPr id="1" name="" descr="" title=""/>
+            <wp:cNvGraphicFramePr>
+              <a:graphicFrameLocks xmlns:a="http://schemas.openxmlformats.org/drawingml/2006/main" noChangeAspect="1"/>
+            </wp:cNvGraphicFramePr>
+            <a:graphic xmlns:a="http://schemas.openxmlformats.org/drawingml/2006/main">
+              <a:graphicData uri="http://schemas.openxmlformats.org/drawingml/2006/picture">
+                <pic:pic xmlns:pic="http://schemas.openxmlformats.org/drawingml/2006/picture">
+                  <pic:nvPicPr>
+                    <pic:cNvPr id="0" name="" descr=""/>
+                    <pic:cNvPicPr>
+                      <a:picLocks noChangeAspect="1" noChangeArrowheads="1"/>
+                    </pic:cNvPicPr>
+                  </pic:nvPicPr>
+                  <pic:blipFill>
+                    <a:blip r:embed="rId10" cstate="none"/>
+                    <a:srcRect/>
+                    <a:stretch>
+                      <a:fillRect/>
+                    </a:stretch>
+                  </pic:blipFill>
+                  <pic:spPr bwMode="auto">
+                    <a:xfrm>
+                      <a:off x="0" y="0"/>
+                      <a:ext cx="4143375" cy="895350"/>
+                    </a:xfrm>
+                    <a:prstGeom prst="rect">
+                      <a:avLst/>
+                    </a:prstGeom>
+                  </pic:spPr>
+                </pic:pic>
+              </a:graphicData>
+            </a:graphic>
+          </wp:inline>
+        </w:drawing>
+      </w:r>
+    </w:p>
+    <w:p>
+      <w:pPr>
+        <w:spacing w:after="140" w:line="300"/>
+        <w:ind w:firstLine="431"/>
+        <w:jc w:val="both"/>
+      </w:pPr>
       <w:r>
         <w:rPr>
           <w:rFonts w:ascii="Calibri" w:cs="Calibri" w:eastAsia="Calibri" w:hAnsi="Calibri"/>
@@ -1398,8 +1586,31 @@
           <w:sz w:val="22"/>
           <w:szCs w:val="22"/>
         </w:rPr>
-        <w:t xml:space="preserve">Σ</w:t>
-      </w:r>
+        <w:t xml:space="preserve">El modelo de Ghosh et al. (2013) advierte que esta regla lineal esconde un límite: si la reacción es positiva a niveles bajos de deuda o de riesgo, pero se anula o se vuelve negativa por encima de cierto umbral, el contraste lineal informa sostenibilidad donde en realidad hay fatiga fiscal. De ahí que el protocolo incluya modelos de umbral con punto de quiebre estimado de forma endógena.</w:t>
+      </w:r>
+    </w:p>
+    <w:p>
+      <w:pPr>
+        <w:pStyle w:val="Heading1"/>
+        <w:spacing w:after="130" w:before="340"/>
+      </w:pPr>
+      <w:r>
+        <w:rPr>
+          <w:rFonts w:ascii="Calibri" w:cs="Calibri" w:eastAsia="Calibri" w:hAnsi="Calibri"/>
+          <w:b/>
+          <w:bCs/>
+          <w:sz w:val="26"/>
+          <w:szCs w:val="26"/>
+        </w:rPr>
+        <w:t xml:space="preserve">4. Estrategia econométrica</w:t>
+      </w:r>
+    </w:p>
+    <w:p>
+      <w:pPr>
+        <w:spacing w:after="140" w:line="300"/>
+        <w:ind w:firstLine="431"/>
+        <w:jc w:val="both"/>
+      </w:pPr>
       <w:r>
         <w:rPr>
           <w:rFonts w:ascii="Calibri" w:cs="Calibri" w:eastAsia="Calibri" w:hAnsi="Calibri"/>
@@ -1409,10 +1620,32 @@
           <w:iCs w:val="false"/>
           <w:sz w:val="22"/>
           <w:szCs w:val="22"/>
-          <w:vertAlign w:val="subscript"/>
-        </w:rPr>
-        <w:t xml:space="preserve">j = 0</w:t>
-      </w:r>
+        </w:rPr>
+        <w:t xml:space="preserve">El protocolo tiene seis etapas encadenadas, cada una diseñada para neutralizar un sesgo concreto de la anterior: raíces unitarias y regresión espuria, endogeneidad de corto plazo, endogeneidad del riesgo soberano, no linealidad de umbral y, finalmente, incertidumbre de escenario.</w:t>
+      </w:r>
+    </w:p>
+    <w:p>
+      <w:pPr>
+        <w:pStyle w:val="Heading2"/>
+        <w:spacing w:after="100" w:before="240"/>
+      </w:pPr>
+      <w:r>
+        <w:rPr>
+          <w:rFonts w:ascii="Calibri" w:cs="Calibri" w:eastAsia="Calibri" w:hAnsi="Calibri"/>
+          <w:b/>
+          <w:bCs/>
+          <w:sz w:val="23"/>
+          <w:szCs w:val="23"/>
+        </w:rPr>
+        <w:t xml:space="preserve">4.1. Estacionariedad y quiebres</w:t>
+      </w:r>
+    </w:p>
+    <w:p>
+      <w:pPr>
+        <w:spacing w:after="140" w:line="300"/>
+        <w:ind w:firstLine="431"/>
+        <w:jc w:val="both"/>
+      </w:pPr>
       <w:r>
         <w:rPr>
           <w:rFonts w:ascii="Calibri" w:cs="Calibri" w:eastAsia="Calibri" w:hAnsi="Calibri"/>
@@ -1422,10 +1655,32 @@
           <w:iCs w:val="false"/>
           <w:sz w:val="22"/>
           <w:szCs w:val="22"/>
-          <w:vertAlign w:val="superscript"/>
-        </w:rPr>
-        <w:t xml:space="preserve">∞</w:t>
-      </w:r>
+        </w:rPr>
+        <w:t xml:space="preserve">Sobre cada serie se aplican los contrastes ADF y KPSS, de hipótesis nulas opuestas, más el DF-GLS de Elliott, Rothenberg y Stock (1996), de mayor potencia en muestras de este tamaño. Ante diagnóstico ambiguo se añade el test de quiebre endógeno de Zivot y Andrews (1992), que estima la fecha de ruptura por búsqueda del punto que minimiza el estadístico t del parámetro autorregresivo. Sobre la ratio de deuda se implementa además el procedimiento de Bai y Perron (2003): programación dinámica exacta sobre la suma de cuadrados residuales, con selección del número de quiebres por criterio BIC.</w:t>
+      </w:r>
+    </w:p>
+    <w:p>
+      <w:pPr>
+        <w:pStyle w:val="Heading2"/>
+        <w:spacing w:after="100" w:before="240"/>
+      </w:pPr>
+      <w:r>
+        <w:rPr>
+          <w:rFonts w:ascii="Calibri" w:cs="Calibri" w:eastAsia="Calibri" w:hAnsi="Calibri"/>
+          <w:b/>
+          <w:bCs/>
+          <w:sz w:val="23"/>
+          <w:szCs w:val="23"/>
+        </w:rPr>
+        <w:t xml:space="preserve">4.2. Cointegración y vector con corrección de error</w:t>
+      </w:r>
+    </w:p>
+    <w:p>
+      <w:pPr>
+        <w:spacing w:after="140" w:line="300"/>
+        <w:ind w:firstLine="431"/>
+        <w:jc w:val="both"/>
+      </w:pPr>
       <w:r>
         <w:rPr>
           <w:rFonts w:ascii="Calibri" w:cs="Calibri" w:eastAsia="Calibri" w:hAnsi="Calibri"/>
@@ -1436,7 +1691,72 @@
           <w:sz w:val="22"/>
           <w:szCs w:val="22"/>
         </w:rPr>
-        <w:t xml:space="preserve">  </w:t>
+        <w:t xml:space="preserve">El procedimiento de máxima verosimilitud de Johansen verifica si el sistema formado por la ratio de deuda, el resultado primario, el riesgo soberano y el tipo de cambio real admite al menos una combinación lineal estacionaria. El sistema se estima como vector con corrección de error:</w:t>
+      </w:r>
+    </w:p>
+    <w:p>
+      <w:pPr>
+        <w:spacing w:after="170" w:before="140"/>
+        <w:jc w:val="center"/>
+      </w:pPr>
+      <w:r>
+        <w:drawing>
+          <wp:inline distT="0" distB="0" distL="0" distR="0">
+            <wp:extent cx="5715000" cy="971550"/>
+            <wp:effectExtent t="0" r="0" b="0" l="0"/>
+            <wp:docPr id="1" name="" descr="" title=""/>
+            <wp:cNvGraphicFramePr>
+              <a:graphicFrameLocks xmlns:a="http://schemas.openxmlformats.org/drawingml/2006/main" noChangeAspect="1"/>
+            </wp:cNvGraphicFramePr>
+            <a:graphic xmlns:a="http://schemas.openxmlformats.org/drawingml/2006/main">
+              <a:graphicData uri="http://schemas.openxmlformats.org/drawingml/2006/picture">
+                <pic:pic xmlns:pic="http://schemas.openxmlformats.org/drawingml/2006/picture">
+                  <pic:nvPicPr>
+                    <pic:cNvPr id="0" name="" descr=""/>
+                    <pic:cNvPicPr>
+                      <a:picLocks noChangeAspect="1" noChangeArrowheads="1"/>
+                    </pic:cNvPicPr>
+                  </pic:nvPicPr>
+                  <pic:blipFill>
+                    <a:blip r:embed="rId11" cstate="none"/>
+                    <a:srcRect/>
+                    <a:stretch>
+                      <a:fillRect/>
+                    </a:stretch>
+                  </pic:blipFill>
+                  <pic:spPr bwMode="auto">
+                    <a:xfrm>
+                      <a:off x="0" y="0"/>
+                      <a:ext cx="5715000" cy="971550"/>
+                    </a:xfrm>
+                    <a:prstGeom prst="rect">
+                      <a:avLst/>
+                    </a:prstGeom>
+                  </pic:spPr>
+                </pic:pic>
+              </a:graphicData>
+            </a:graphic>
+          </wp:inline>
+        </w:drawing>
+      </w:r>
+    </w:p>
+    <w:p>
+      <w:pPr>
+        <w:spacing w:after="140" w:line="300"/>
+        <w:ind w:firstLine="431"/>
+        <w:jc w:val="both"/>
+      </w:pPr>
+      <w:r>
+        <w:rPr>
+          <w:rFonts w:ascii="Calibri" w:cs="Calibri" w:eastAsia="Calibri" w:hAnsi="Calibri"/>
+          <w:b w:val="false"/>
+          <w:bCs w:val="false"/>
+          <w:i w:val="false"/>
+          <w:iCs w:val="false"/>
+          <w:sz w:val="22"/>
+          <w:szCs w:val="22"/>
+        </w:rPr>
+        <w:t xml:space="preserve">El vector </w:t>
       </w:r>
       <w:r>
         <w:rPr>
@@ -1448,7 +1768,19 @@
           <w:sz w:val="22"/>
           <w:szCs w:val="22"/>
         </w:rPr>
-        <w:t xml:space="preserve">sp</w:t>
+        <w:t xml:space="preserve">β</w:t>
+      </w:r>
+      <w:r>
+        <w:rPr>
+          <w:rFonts w:ascii="Calibri" w:cs="Calibri" w:eastAsia="Calibri" w:hAnsi="Calibri"/>
+          <w:b w:val="false"/>
+          <w:bCs w:val="false"/>
+          <w:i w:val="false"/>
+          <w:iCs w:val="false"/>
+          <w:sz w:val="22"/>
+          <w:szCs w:val="22"/>
+        </w:rPr>
+        <w:t xml:space="preserve"> recoge la relación de largo plazo, normalizada sobre la deuda; el vector </w:t>
       </w:r>
       <w:r>
         <w:rPr>
@@ -1459,9 +1791,8 @@
           <w:iCs/>
           <w:sz w:val="22"/>
           <w:szCs w:val="22"/>
-          <w:vertAlign w:val="subscript"/>
-        </w:rPr>
-        <w:t xml:space="preserve">t+j</w:t>
+        </w:rPr>
+        <w:t xml:space="preserve">α</w:t>
       </w:r>
       <w:r>
         <w:rPr>
@@ -1473,20 +1804,31 @@
           <w:sz w:val="22"/>
           <w:szCs w:val="22"/>
         </w:rPr>
-        <w:t xml:space="preserve"> / (1 + </w:t>
-      </w:r>
-      <w:r>
-        <w:rPr>
-          <w:rFonts w:ascii="Calibri" w:cs="Calibri" w:eastAsia="Calibri" w:hAnsi="Calibri"/>
-          <w:b w:val="false"/>
-          <w:bCs w:val="false"/>
-          <w:i/>
-          <w:iCs/>
-          <w:sz w:val="22"/>
-          <w:szCs w:val="22"/>
-        </w:rPr>
-        <w:t xml:space="preserve">r</w:t>
-      </w:r>
+        <w:t xml:space="preserve"> contiene las velocidades de ajuste de cada variable hacia el equilibrio. La brecha del producto entra como variable exógena estacionaria. El rango de cointegración se fija en uno; en la ventana ampliada esa imposición no es neutral, porque el contraste de Johansen es sensible a incluir o no el año 1999, y esa fragilidad se documenta en lugar de ocultarse.</w:t>
+      </w:r>
+    </w:p>
+    <w:p>
+      <w:pPr>
+        <w:pStyle w:val="Heading2"/>
+        <w:spacing w:after="100" w:before="240"/>
+      </w:pPr>
+      <w:r>
+        <w:rPr>
+          <w:rFonts w:ascii="Calibri" w:cs="Calibri" w:eastAsia="Calibri" w:hAnsi="Calibri"/>
+          <w:b/>
+          <w:bCs/>
+          <w:sz w:val="23"/>
+          <w:szCs w:val="23"/>
+        </w:rPr>
+        <w:t xml:space="preserve">4.3. VAR estructural restringido</w:t>
+      </w:r>
+    </w:p>
+    <w:p>
+      <w:pPr>
+        <w:spacing w:after="140" w:line="300"/>
+        <w:ind w:firstLine="431"/>
+        <w:jc w:val="both"/>
+      </w:pPr>
       <w:r>
         <w:rPr>
           <w:rFonts w:ascii="Calibri" w:cs="Calibri" w:eastAsia="Calibri" w:hAnsi="Calibri"/>
@@ -1497,1347 +1839,53 @@
           <w:sz w:val="22"/>
           <w:szCs w:val="22"/>
         </w:rPr>
-        <w:t xml:space="preserve">)</w:t>
-      </w:r>
-      <w:r>
-        <w:rPr>
-          <w:rFonts w:ascii="Calibri" w:cs="Calibri" w:eastAsia="Calibri" w:hAnsi="Calibri"/>
-          <w:b w:val="false"/>
-          <w:bCs w:val="false"/>
-          <w:i/>
-          <w:iCs/>
-          <w:sz w:val="22"/>
-          <w:szCs w:val="22"/>
-          <w:vertAlign w:val="superscript"/>
-        </w:rPr>
-        <w:t xml:space="preserve">j+1</w:t>
-      </w:r>
-    </w:p>
-    <w:p>
-      <w:pPr>
-        <w:spacing w:after="140" w:line="300"/>
-        <w:ind w:firstLine="431"/>
-        <w:jc w:val="both"/>
-      </w:pPr>
-      <w:r>
-        <w:rPr>
-          <w:rFonts w:ascii="Calibri" w:cs="Calibri" w:eastAsia="Calibri" w:hAnsi="Calibri"/>
-          <w:b w:val="false"/>
-          <w:bCs w:val="false"/>
-          <w:i w:val="false"/>
-          <w:iCs w:val="false"/>
-          <w:sz w:val="22"/>
-          <w:szCs w:val="22"/>
-        </w:rPr>
-        <w:t xml:space="preserve">Esta condición no es directamente contrastable. Bohn (1998, 2007) propone una condición suficiente que sí lo es: si el resultado primario responde positivamente al stock de deuda rezagado, la restricción intertemporal se cumple de forma asintótica, sin necesidad de suponer una tasa de descuento ni de proyectar a infinito, y sin exigir estacionariedad de las series. La función de reacción fiscal, en su forma canónica, es:</w:t>
-      </w:r>
-    </w:p>
-    <w:p>
-      <w:pPr>
-        <w:spacing w:after="150" w:before="110"/>
+        <w:t xml:space="preserve">Para identificar la transmisión de perturbaciones sin recurrir a un ordenamiento de Cholesky arbitrario, se estima un VAR estructural restringido sobre el vector de cinco variables, siguiendo el esquema de identificación contemporánea de Blanchard y Perotti (2002) y la restricción de acumulación de deuda de Favero y Giavazzi (2007). El sistema estructural es:</w:t>
+      </w:r>
+    </w:p>
+    <w:p>
+      <w:pPr>
+        <w:spacing w:after="170" w:before="140"/>
         <w:jc w:val="center"/>
       </w:pPr>
       <w:r>
-        <w:rPr>
-          <w:rFonts w:ascii="Calibri" w:cs="Calibri" w:eastAsia="Calibri" w:hAnsi="Calibri"/>
-          <w:b w:val="false"/>
-          <w:bCs w:val="false"/>
-          <w:i/>
-          <w:iCs/>
-          <w:sz w:val="22"/>
-          <w:szCs w:val="22"/>
-        </w:rPr>
-        <w:t xml:space="preserve">pb</w:t>
-      </w:r>
-      <w:r>
-        <w:rPr>
-          <w:rFonts w:ascii="Calibri" w:cs="Calibri" w:eastAsia="Calibri" w:hAnsi="Calibri"/>
-          <w:b w:val="false"/>
-          <w:bCs w:val="false"/>
-          <w:i/>
-          <w:iCs/>
-          <w:sz w:val="22"/>
-          <w:szCs w:val="22"/>
-          <w:vertAlign w:val="subscript"/>
-        </w:rPr>
-        <w:t xml:space="preserve">t</w:t>
-      </w:r>
-      <w:r>
-        <w:rPr>
-          <w:rFonts w:ascii="Calibri" w:cs="Calibri" w:eastAsia="Calibri" w:hAnsi="Calibri"/>
-          <w:b w:val="false"/>
-          <w:bCs w:val="false"/>
-          <w:i w:val="false"/>
-          <w:iCs w:val="false"/>
-          <w:sz w:val="22"/>
-          <w:szCs w:val="22"/>
-        </w:rPr>
-        <w:t xml:space="preserve">  =  α  +  ρ </w:t>
-      </w:r>
-      <w:r>
-        <w:rPr>
-          <w:rFonts w:ascii="Calibri" w:cs="Calibri" w:eastAsia="Calibri" w:hAnsi="Calibri"/>
-          <w:b w:val="false"/>
-          <w:bCs w:val="false"/>
-          <w:i/>
-          <w:iCs/>
-          <w:sz w:val="22"/>
-          <w:szCs w:val="22"/>
-        </w:rPr>
-        <w:t xml:space="preserve">d</w:t>
-      </w:r>
-      <w:r>
-        <w:rPr>
-          <w:rFonts w:ascii="Calibri" w:cs="Calibri" w:eastAsia="Calibri" w:hAnsi="Calibri"/>
-          <w:b w:val="false"/>
-          <w:bCs w:val="false"/>
-          <w:i/>
-          <w:iCs/>
-          <w:sz w:val="22"/>
-          <w:szCs w:val="22"/>
-          <w:vertAlign w:val="subscript"/>
-        </w:rPr>
-        <w:t xml:space="preserve">t−1</w:t>
-      </w:r>
-      <w:r>
-        <w:rPr>
-          <w:rFonts w:ascii="Calibri" w:cs="Calibri" w:eastAsia="Calibri" w:hAnsi="Calibri"/>
-          <w:b w:val="false"/>
-          <w:bCs w:val="false"/>
-          <w:i w:val="false"/>
-          <w:iCs w:val="false"/>
-          <w:sz w:val="22"/>
-          <w:szCs w:val="22"/>
-        </w:rPr>
-        <w:t xml:space="preserve">  +  β</w:t>
-      </w:r>
-      <w:r>
-        <w:rPr>
-          <w:rFonts w:ascii="Calibri" w:cs="Calibri" w:eastAsia="Calibri" w:hAnsi="Calibri"/>
-          <w:b w:val="false"/>
-          <w:bCs w:val="false"/>
-          <w:i w:val="false"/>
-          <w:iCs w:val="false"/>
-          <w:sz w:val="22"/>
-          <w:szCs w:val="22"/>
-          <w:vertAlign w:val="subscript"/>
-        </w:rPr>
-        <w:t xml:space="preserve">1</w:t>
-      </w:r>
-      <w:r>
-        <w:rPr>
-          <w:rFonts w:ascii="Calibri" w:cs="Calibri" w:eastAsia="Calibri" w:hAnsi="Calibri"/>
-          <w:b w:val="false"/>
-          <w:bCs w:val="false"/>
-          <w:i w:val="false"/>
-          <w:iCs w:val="false"/>
-          <w:sz w:val="22"/>
-          <w:szCs w:val="22"/>
-        </w:rPr>
-        <w:t xml:space="preserve"> </w:t>
-      </w:r>
-      <w:r>
-        <w:rPr>
-          <w:rFonts w:ascii="Calibri" w:cs="Calibri" w:eastAsia="Calibri" w:hAnsi="Calibri"/>
-          <w:b w:val="false"/>
-          <w:bCs w:val="false"/>
-          <w:i/>
-          <w:iCs/>
-          <w:sz w:val="22"/>
-          <w:szCs w:val="22"/>
-        </w:rPr>
-        <w:t xml:space="preserve">ỹ</w:t>
-      </w:r>
-      <w:r>
-        <w:rPr>
-          <w:rFonts w:ascii="Calibri" w:cs="Calibri" w:eastAsia="Calibri" w:hAnsi="Calibri"/>
-          <w:b w:val="false"/>
-          <w:bCs w:val="false"/>
-          <w:i/>
-          <w:iCs/>
-          <w:sz w:val="22"/>
-          <w:szCs w:val="22"/>
-          <w:vertAlign w:val="subscript"/>
-        </w:rPr>
-        <w:t xml:space="preserve">t</w:t>
-      </w:r>
-      <w:r>
-        <w:rPr>
-          <w:rFonts w:ascii="Calibri" w:cs="Calibri" w:eastAsia="Calibri" w:hAnsi="Calibri"/>
-          <w:b w:val="false"/>
-          <w:bCs w:val="false"/>
-          <w:i w:val="false"/>
-          <w:iCs w:val="false"/>
-          <w:sz w:val="22"/>
-          <w:szCs w:val="22"/>
-        </w:rPr>
-        <w:t xml:space="preserve">  +  β</w:t>
-      </w:r>
-      <w:r>
-        <w:rPr>
-          <w:rFonts w:ascii="Calibri" w:cs="Calibri" w:eastAsia="Calibri" w:hAnsi="Calibri"/>
-          <w:b w:val="false"/>
-          <w:bCs w:val="false"/>
-          <w:i w:val="false"/>
-          <w:iCs w:val="false"/>
-          <w:sz w:val="22"/>
-          <w:szCs w:val="22"/>
-          <w:vertAlign w:val="subscript"/>
-        </w:rPr>
-        <w:t xml:space="preserve">2</w:t>
-      </w:r>
-      <w:r>
-        <w:rPr>
-          <w:rFonts w:ascii="Calibri" w:cs="Calibri" w:eastAsia="Calibri" w:hAnsi="Calibri"/>
-          <w:b w:val="false"/>
-          <w:bCs w:val="false"/>
-          <w:i w:val="false"/>
-          <w:iCs w:val="false"/>
-          <w:sz w:val="22"/>
-          <w:szCs w:val="22"/>
-        </w:rPr>
-        <w:t xml:space="preserve"> </w:t>
-      </w:r>
-      <w:r>
-        <w:rPr>
-          <w:rFonts w:ascii="Calibri" w:cs="Calibri" w:eastAsia="Calibri" w:hAnsi="Calibri"/>
-          <w:b w:val="false"/>
-          <w:bCs w:val="false"/>
-          <w:i/>
-          <w:iCs/>
-          <w:sz w:val="22"/>
-          <w:szCs w:val="22"/>
-        </w:rPr>
-        <w:t xml:space="preserve">g</w:t>
-      </w:r>
-      <w:r>
-        <w:rPr>
-          <w:rFonts w:ascii="Calibri" w:cs="Calibri" w:eastAsia="Calibri" w:hAnsi="Calibri"/>
-          <w:b w:val="false"/>
-          <w:bCs w:val="false"/>
-          <w:i/>
-          <w:iCs/>
-          <w:sz w:val="22"/>
-          <w:szCs w:val="22"/>
-          <w:vertAlign w:val="subscript"/>
-        </w:rPr>
-        <w:t xml:space="preserve">t</w:t>
-      </w:r>
-      <w:r>
-        <w:rPr>
-          <w:rFonts w:ascii="Calibri" w:cs="Calibri" w:eastAsia="Calibri" w:hAnsi="Calibri"/>
-          <w:b w:val="false"/>
-          <w:bCs w:val="false"/>
-          <w:i/>
-          <w:iCs/>
-          <w:sz w:val="22"/>
-          <w:szCs w:val="22"/>
-          <w:vertAlign w:val="superscript"/>
-        </w:rPr>
-        <w:t xml:space="preserve">exp</w:t>
-      </w:r>
-      <w:r>
-        <w:rPr>
-          <w:rFonts w:ascii="Calibri" w:cs="Calibri" w:eastAsia="Calibri" w:hAnsi="Calibri"/>
-          <w:b w:val="false"/>
-          <w:bCs w:val="false"/>
-          <w:i w:val="false"/>
-          <w:iCs w:val="false"/>
-          <w:sz w:val="22"/>
-          <w:szCs w:val="22"/>
-        </w:rPr>
-        <w:t xml:space="preserve">  +  </w:t>
-      </w:r>
-      <w:r>
-        <w:rPr>
-          <w:rFonts w:ascii="Calibri" w:cs="Calibri" w:eastAsia="Calibri" w:hAnsi="Calibri"/>
-          <w:b w:val="false"/>
-          <w:bCs w:val="false"/>
-          <w:i/>
-          <w:iCs/>
-          <w:sz w:val="22"/>
-          <w:szCs w:val="22"/>
-        </w:rPr>
-        <w:t xml:space="preserve">u</w:t>
-      </w:r>
-      <w:r>
-        <w:rPr>
-          <w:rFonts w:ascii="Calibri" w:cs="Calibri" w:eastAsia="Calibri" w:hAnsi="Calibri"/>
-          <w:b w:val="false"/>
-          <w:bCs w:val="false"/>
-          <w:i/>
-          <w:iCs/>
-          <w:sz w:val="22"/>
-          <w:szCs w:val="22"/>
-          <w:vertAlign w:val="subscript"/>
-        </w:rPr>
-        <w:t xml:space="preserve">t</w:t>
-      </w:r>
-    </w:p>
-    <w:p>
-      <w:pPr>
-        <w:spacing w:after="140" w:line="300"/>
-        <w:ind w:firstLine="431"/>
-        <w:jc w:val="both"/>
-      </w:pPr>
-      <w:r>
-        <w:rPr>
-          <w:rFonts w:ascii="Calibri" w:cs="Calibri" w:eastAsia="Calibri" w:hAnsi="Calibri"/>
-          <w:b w:val="false"/>
-          <w:bCs w:val="false"/>
-          <w:i w:val="false"/>
-          <w:iCs w:val="false"/>
-          <w:sz w:val="22"/>
-          <w:szCs w:val="22"/>
-        </w:rPr>
-        <w:t xml:space="preserve">La hipótesis de sostenibilidad exige </w:t>
-      </w:r>
-      <w:r>
-        <w:rPr>
-          <w:rFonts w:ascii="Calibri" w:cs="Calibri" w:eastAsia="Calibri" w:hAnsi="Calibri"/>
-          <w:b w:val="false"/>
-          <w:bCs w:val="false"/>
-          <w:i/>
-          <w:iCs/>
-          <w:sz w:val="22"/>
-          <w:szCs w:val="22"/>
-        </w:rPr>
-        <w:t xml:space="preserve">ρ &gt; 0</w:t>
-      </w:r>
-      <w:r>
-        <w:rPr>
-          <w:rFonts w:ascii="Calibri" w:cs="Calibri" w:eastAsia="Calibri" w:hAnsi="Calibri"/>
-          <w:b w:val="false"/>
-          <w:bCs w:val="false"/>
-          <w:i w:val="false"/>
-          <w:iCs w:val="false"/>
-          <w:sz w:val="22"/>
-          <w:szCs w:val="22"/>
-        </w:rPr>
-        <w:t xml:space="preserve"> con significatividad estadística. La proyección de trayectorias se apoya en la ecuación de movimiento de la ratio de deuda (Blanchard, 2019), donde el término </w:t>
-      </w:r>
-      <w:r>
-        <w:rPr>
-          <w:rFonts w:ascii="Calibri" w:cs="Calibri" w:eastAsia="Calibri" w:hAnsi="Calibri"/>
-          <w:b w:val="false"/>
-          <w:bCs w:val="false"/>
-          <w:i/>
-          <w:iCs/>
-          <w:sz w:val="22"/>
-          <w:szCs w:val="22"/>
-        </w:rPr>
-        <w:t xml:space="preserve">(r − g)</w:t>
-      </w:r>
-      <w:r>
-        <w:rPr>
-          <w:rFonts w:ascii="Calibri" w:cs="Calibri" w:eastAsia="Calibri" w:hAnsi="Calibri"/>
-          <w:b w:val="false"/>
-          <w:bCs w:val="false"/>
-          <w:i w:val="false"/>
-          <w:iCs w:val="false"/>
-          <w:sz w:val="22"/>
-          <w:szCs w:val="22"/>
-        </w:rPr>
-        <w:t xml:space="preserve"> gobierna el efecto de bola de nieve:</w:t>
-      </w:r>
-    </w:p>
-    <w:p>
-      <w:pPr>
-        <w:spacing w:after="150" w:before="110"/>
-        <w:jc w:val="center"/>
-      </w:pPr>
-      <w:r>
-        <w:rPr>
-          <w:rFonts w:ascii="Calibri" w:cs="Calibri" w:eastAsia="Calibri" w:hAnsi="Calibri"/>
-          <w:b w:val="false"/>
-          <w:bCs w:val="false"/>
-          <w:i w:val="false"/>
-          <w:iCs w:val="false"/>
-          <w:sz w:val="22"/>
-          <w:szCs w:val="22"/>
-        </w:rPr>
-        <w:t xml:space="preserve">Δ</w:t>
-      </w:r>
-      <w:r>
-        <w:rPr>
-          <w:rFonts w:ascii="Calibri" w:cs="Calibri" w:eastAsia="Calibri" w:hAnsi="Calibri"/>
-          <w:b w:val="false"/>
-          <w:bCs w:val="false"/>
-          <w:i/>
-          <w:iCs/>
-          <w:sz w:val="22"/>
-          <w:szCs w:val="22"/>
-        </w:rPr>
-        <w:t xml:space="preserve">d</w:t>
-      </w:r>
-      <w:r>
-        <w:rPr>
-          <w:rFonts w:ascii="Calibri" w:cs="Calibri" w:eastAsia="Calibri" w:hAnsi="Calibri"/>
-          <w:b w:val="false"/>
-          <w:bCs w:val="false"/>
-          <w:i/>
-          <w:iCs/>
-          <w:sz w:val="22"/>
-          <w:szCs w:val="22"/>
-          <w:vertAlign w:val="subscript"/>
-        </w:rPr>
-        <w:t xml:space="preserve">t</w:t>
-      </w:r>
-      <w:r>
-        <w:rPr>
-          <w:rFonts w:ascii="Calibri" w:cs="Calibri" w:eastAsia="Calibri" w:hAnsi="Calibri"/>
-          <w:b w:val="false"/>
-          <w:bCs w:val="false"/>
-          <w:i w:val="false"/>
-          <w:iCs w:val="false"/>
-          <w:sz w:val="22"/>
-          <w:szCs w:val="22"/>
-        </w:rPr>
-        <w:t xml:space="preserve">  =  [ ( </w:t>
-      </w:r>
-      <w:r>
-        <w:rPr>
-          <w:rFonts w:ascii="Calibri" w:cs="Calibri" w:eastAsia="Calibri" w:hAnsi="Calibri"/>
-          <w:b w:val="false"/>
-          <w:bCs w:val="false"/>
-          <w:i/>
-          <w:iCs/>
-          <w:sz w:val="22"/>
-          <w:szCs w:val="22"/>
-        </w:rPr>
-        <w:t xml:space="preserve">r</w:t>
-      </w:r>
-      <w:r>
-        <w:rPr>
-          <w:rFonts w:ascii="Calibri" w:cs="Calibri" w:eastAsia="Calibri" w:hAnsi="Calibri"/>
-          <w:b w:val="false"/>
-          <w:bCs w:val="false"/>
-          <w:i/>
-          <w:iCs/>
-          <w:sz w:val="22"/>
-          <w:szCs w:val="22"/>
-          <w:vertAlign w:val="subscript"/>
-        </w:rPr>
-        <w:t xml:space="preserve">t</w:t>
-      </w:r>
-      <w:r>
-        <w:rPr>
-          <w:rFonts w:ascii="Calibri" w:cs="Calibri" w:eastAsia="Calibri" w:hAnsi="Calibri"/>
-          <w:b w:val="false"/>
-          <w:bCs w:val="false"/>
-          <w:i w:val="false"/>
-          <w:iCs w:val="false"/>
-          <w:sz w:val="22"/>
-          <w:szCs w:val="22"/>
-        </w:rPr>
-        <w:t xml:space="preserve"> − </w:t>
-      </w:r>
-      <w:r>
-        <w:rPr>
-          <w:rFonts w:ascii="Calibri" w:cs="Calibri" w:eastAsia="Calibri" w:hAnsi="Calibri"/>
-          <w:b w:val="false"/>
-          <w:bCs w:val="false"/>
-          <w:i/>
-          <w:iCs/>
-          <w:sz w:val="22"/>
-          <w:szCs w:val="22"/>
-        </w:rPr>
-        <w:t xml:space="preserve">g</w:t>
-      </w:r>
-      <w:r>
-        <w:rPr>
-          <w:rFonts w:ascii="Calibri" w:cs="Calibri" w:eastAsia="Calibri" w:hAnsi="Calibri"/>
-          <w:b w:val="false"/>
-          <w:bCs w:val="false"/>
-          <w:i/>
-          <w:iCs/>
-          <w:sz w:val="22"/>
-          <w:szCs w:val="22"/>
-          <w:vertAlign w:val="subscript"/>
-        </w:rPr>
-        <w:t xml:space="preserve">t</w:t>
-      </w:r>
-      <w:r>
-        <w:rPr>
-          <w:rFonts w:ascii="Calibri" w:cs="Calibri" w:eastAsia="Calibri" w:hAnsi="Calibri"/>
-          <w:b w:val="false"/>
-          <w:bCs w:val="false"/>
-          <w:i w:val="false"/>
-          <w:iCs w:val="false"/>
-          <w:sz w:val="22"/>
-          <w:szCs w:val="22"/>
-        </w:rPr>
-        <w:t xml:space="preserve"> ) / ( 1 + </w:t>
-      </w:r>
-      <w:r>
-        <w:rPr>
-          <w:rFonts w:ascii="Calibri" w:cs="Calibri" w:eastAsia="Calibri" w:hAnsi="Calibri"/>
-          <w:b w:val="false"/>
-          <w:bCs w:val="false"/>
-          <w:i/>
-          <w:iCs/>
-          <w:sz w:val="22"/>
-          <w:szCs w:val="22"/>
-        </w:rPr>
-        <w:t xml:space="preserve">g</w:t>
-      </w:r>
-      <w:r>
-        <w:rPr>
-          <w:rFonts w:ascii="Calibri" w:cs="Calibri" w:eastAsia="Calibri" w:hAnsi="Calibri"/>
-          <w:b w:val="false"/>
-          <w:bCs w:val="false"/>
-          <w:i/>
-          <w:iCs/>
-          <w:sz w:val="22"/>
-          <w:szCs w:val="22"/>
-          <w:vertAlign w:val="subscript"/>
-        </w:rPr>
-        <w:t xml:space="preserve">t</w:t>
-      </w:r>
-      <w:r>
-        <w:rPr>
-          <w:rFonts w:ascii="Calibri" w:cs="Calibri" w:eastAsia="Calibri" w:hAnsi="Calibri"/>
-          <w:b w:val="false"/>
-          <w:bCs w:val="false"/>
-          <w:i w:val="false"/>
-          <w:iCs w:val="false"/>
-          <w:sz w:val="22"/>
-          <w:szCs w:val="22"/>
-        </w:rPr>
-        <w:t xml:space="preserve"> ) ] </w:t>
-      </w:r>
-      <w:r>
-        <w:rPr>
-          <w:rFonts w:ascii="Calibri" w:cs="Calibri" w:eastAsia="Calibri" w:hAnsi="Calibri"/>
-          <w:b w:val="false"/>
-          <w:bCs w:val="false"/>
-          <w:i/>
-          <w:iCs/>
-          <w:sz w:val="22"/>
-          <w:szCs w:val="22"/>
-        </w:rPr>
-        <w:t xml:space="preserve">d</w:t>
-      </w:r>
-      <w:r>
-        <w:rPr>
-          <w:rFonts w:ascii="Calibri" w:cs="Calibri" w:eastAsia="Calibri" w:hAnsi="Calibri"/>
-          <w:b w:val="false"/>
-          <w:bCs w:val="false"/>
-          <w:i/>
-          <w:iCs/>
-          <w:sz w:val="22"/>
-          <w:szCs w:val="22"/>
-          <w:vertAlign w:val="subscript"/>
-        </w:rPr>
-        <w:t xml:space="preserve">t−1</w:t>
-      </w:r>
-      <w:r>
-        <w:rPr>
-          <w:rFonts w:ascii="Calibri" w:cs="Calibri" w:eastAsia="Calibri" w:hAnsi="Calibri"/>
-          <w:b w:val="false"/>
-          <w:bCs w:val="false"/>
-          <w:i w:val="false"/>
-          <w:iCs w:val="false"/>
-          <w:sz w:val="22"/>
-          <w:szCs w:val="22"/>
-        </w:rPr>
-        <w:t xml:space="preserve">  −  </w:t>
-      </w:r>
-      <w:r>
-        <w:rPr>
-          <w:rFonts w:ascii="Calibri" w:cs="Calibri" w:eastAsia="Calibri" w:hAnsi="Calibri"/>
-          <w:b w:val="false"/>
-          <w:bCs w:val="false"/>
-          <w:i/>
-          <w:iCs/>
-          <w:sz w:val="22"/>
-          <w:szCs w:val="22"/>
-        </w:rPr>
-        <w:t xml:space="preserve">sp</w:t>
-      </w:r>
-      <w:r>
-        <w:rPr>
-          <w:rFonts w:ascii="Calibri" w:cs="Calibri" w:eastAsia="Calibri" w:hAnsi="Calibri"/>
-          <w:b w:val="false"/>
-          <w:bCs w:val="false"/>
-          <w:i/>
-          <w:iCs/>
-          <w:sz w:val="22"/>
-          <w:szCs w:val="22"/>
-          <w:vertAlign w:val="subscript"/>
-        </w:rPr>
-        <w:t xml:space="preserve">t</w:t>
-      </w:r>
-    </w:p>
-    <w:p>
-      <w:pPr>
-        <w:spacing w:after="140" w:line="300"/>
-        <w:ind w:firstLine="431"/>
-        <w:jc w:val="both"/>
-      </w:pPr>
-      <w:r>
-        <w:rPr>
-          <w:rFonts w:ascii="Calibri" w:cs="Calibri" w:eastAsia="Calibri" w:hAnsi="Calibri"/>
-          <w:b w:val="false"/>
-          <w:bCs w:val="false"/>
-          <w:i w:val="false"/>
-          <w:iCs w:val="false"/>
-          <w:sz w:val="22"/>
-          <w:szCs w:val="22"/>
-        </w:rPr>
-        <w:t xml:space="preserve">El modelo de Ghosh et al. (2013) advierte que esta regla lineal esconde un límite: si la reacción es positiva a niveles bajos de deuda o de riesgo, pero se anula o se vuelve negativa por encima de cierto umbral, el contraste lineal informa sostenibilidad donde en realidad hay fatiga fiscal. De ahí que el protocolo incluya modelos de umbral con punto de quiebre estimado de forma endógena.</w:t>
-      </w:r>
-    </w:p>
-    <w:p>
-      <w:pPr>
-        <w:pStyle w:val="Heading1"/>
-        <w:spacing w:after="130" w:before="340"/>
-      </w:pPr>
-      <w:r>
-        <w:rPr>
-          <w:rFonts w:ascii="Calibri" w:cs="Calibri" w:eastAsia="Calibri" w:hAnsi="Calibri"/>
-          <w:b/>
-          <w:bCs/>
-          <w:sz w:val="26"/>
-          <w:szCs w:val="26"/>
-        </w:rPr>
-        <w:t xml:space="preserve">4. Estrategia econométrica</w:t>
-      </w:r>
-    </w:p>
-    <w:p>
-      <w:pPr>
-        <w:spacing w:after="140" w:line="300"/>
-        <w:ind w:firstLine="431"/>
-        <w:jc w:val="both"/>
-      </w:pPr>
-      <w:r>
-        <w:rPr>
-          <w:rFonts w:ascii="Calibri" w:cs="Calibri" w:eastAsia="Calibri" w:hAnsi="Calibri"/>
-          <w:b w:val="false"/>
-          <w:bCs w:val="false"/>
-          <w:i w:val="false"/>
-          <w:iCs w:val="false"/>
-          <w:sz w:val="22"/>
-          <w:szCs w:val="22"/>
-        </w:rPr>
-        <w:t xml:space="preserve">El protocolo tiene seis etapas encadenadas, cada una diseñada para neutralizar un sesgo concreto de la anterior: raíces unitarias y regresión espuria, endogeneidad de corto plazo, endogeneidad del riesgo soberano, no linealidad de umbral y, finalmente, incertidumbre de escenario.</w:t>
-      </w:r>
-    </w:p>
-    <w:p>
-      <w:pPr>
-        <w:pStyle w:val="Heading2"/>
-        <w:spacing w:after="100" w:before="240"/>
-      </w:pPr>
-      <w:r>
-        <w:rPr>
-          <w:rFonts w:ascii="Calibri" w:cs="Calibri" w:eastAsia="Calibri" w:hAnsi="Calibri"/>
-          <w:b/>
-          <w:bCs/>
-          <w:sz w:val="23"/>
-          <w:szCs w:val="23"/>
-        </w:rPr>
-        <w:t xml:space="preserve">4.1. Estacionariedad y quiebres</w:t>
-      </w:r>
-    </w:p>
-    <w:p>
-      <w:pPr>
-        <w:spacing w:after="140" w:line="300"/>
-        <w:ind w:firstLine="431"/>
-        <w:jc w:val="both"/>
-      </w:pPr>
-      <w:r>
-        <w:rPr>
-          <w:rFonts w:ascii="Calibri" w:cs="Calibri" w:eastAsia="Calibri" w:hAnsi="Calibri"/>
-          <w:b w:val="false"/>
-          <w:bCs w:val="false"/>
-          <w:i w:val="false"/>
-          <w:iCs w:val="false"/>
-          <w:sz w:val="22"/>
-          <w:szCs w:val="22"/>
-        </w:rPr>
-        <w:t xml:space="preserve">Sobre cada serie se aplican los contrastes ADF y KPSS, de hipótesis nulas opuestas, más el DF-GLS de Elliott, Rothenberg y Stock (1996), de mayor potencia en muestras de este tamaño. Ante diagnóstico ambiguo se añade el test de quiebre endógeno de Zivot y Andrews (1992), que estima la fecha de ruptura por búsqueda del punto que minimiza el estadístico t del parámetro autorregresivo. Sobre la ratio de deuda se implementa además el procedimiento de Bai y Perron (2003): programación dinámica exacta sobre la suma de cuadrados residuales, con selección del número de quiebres por criterio BIC.</w:t>
-      </w:r>
-    </w:p>
-    <w:p>
-      <w:pPr>
-        <w:pStyle w:val="Heading2"/>
-        <w:spacing w:after="100" w:before="240"/>
-      </w:pPr>
-      <w:r>
-        <w:rPr>
-          <w:rFonts w:ascii="Calibri" w:cs="Calibri" w:eastAsia="Calibri" w:hAnsi="Calibri"/>
-          <w:b/>
-          <w:bCs/>
-          <w:sz w:val="23"/>
-          <w:szCs w:val="23"/>
-        </w:rPr>
-        <w:t xml:space="preserve">4.2. Cointegración y vector con corrección de error</w:t>
-      </w:r>
-    </w:p>
-    <w:p>
-      <w:pPr>
-        <w:spacing w:after="140" w:line="300"/>
-        <w:ind w:firstLine="431"/>
-        <w:jc w:val="both"/>
-      </w:pPr>
-      <w:r>
-        <w:rPr>
-          <w:rFonts w:ascii="Calibri" w:cs="Calibri" w:eastAsia="Calibri" w:hAnsi="Calibri"/>
-          <w:b w:val="false"/>
-          <w:bCs w:val="false"/>
-          <w:i w:val="false"/>
-          <w:iCs w:val="false"/>
-          <w:sz w:val="22"/>
-          <w:szCs w:val="22"/>
-        </w:rPr>
-        <w:t xml:space="preserve">El procedimiento de máxima verosimilitud de Johansen verifica si el sistema formado por la ratio de deuda, el resultado primario, el riesgo soberano y el tipo de cambio real admite al menos una combinación lineal estacionaria. El sistema se estima como vector con corrección de error:</w:t>
-      </w:r>
-    </w:p>
-    <w:p>
-      <w:pPr>
-        <w:spacing w:after="150" w:before="110"/>
-        <w:jc w:val="center"/>
-      </w:pPr>
-      <w:r>
-        <w:rPr>
-          <w:rFonts w:ascii="Calibri" w:cs="Calibri" w:eastAsia="Calibri" w:hAnsi="Calibri"/>
-          <w:b w:val="false"/>
-          <w:bCs w:val="false"/>
-          <w:i w:val="false"/>
-          <w:iCs w:val="false"/>
-          <w:sz w:val="22"/>
-          <w:szCs w:val="22"/>
-        </w:rPr>
-        <w:t xml:space="preserve">Δ</w:t>
-      </w:r>
-      <w:r>
-        <w:rPr>
-          <w:rFonts w:ascii="Calibri" w:cs="Calibri" w:eastAsia="Calibri" w:hAnsi="Calibri"/>
-          <w:b w:val="false"/>
-          <w:bCs w:val="false"/>
-          <w:i/>
-          <w:iCs/>
-          <w:sz w:val="22"/>
-          <w:szCs w:val="22"/>
-        </w:rPr>
-        <w:t xml:space="preserve">x</w:t>
-      </w:r>
-      <w:r>
-        <w:rPr>
-          <w:rFonts w:ascii="Calibri" w:cs="Calibri" w:eastAsia="Calibri" w:hAnsi="Calibri"/>
-          <w:b w:val="false"/>
-          <w:bCs w:val="false"/>
-          <w:i/>
-          <w:iCs/>
-          <w:sz w:val="22"/>
-          <w:szCs w:val="22"/>
-          <w:vertAlign w:val="subscript"/>
-        </w:rPr>
-        <w:t xml:space="preserve">t</w:t>
-      </w:r>
-      <w:r>
-        <w:rPr>
-          <w:rFonts w:ascii="Calibri" w:cs="Calibri" w:eastAsia="Calibri" w:hAnsi="Calibri"/>
-          <w:b w:val="false"/>
-          <w:bCs w:val="false"/>
-          <w:i w:val="false"/>
-          <w:iCs w:val="false"/>
-          <w:sz w:val="22"/>
-          <w:szCs w:val="22"/>
-        </w:rPr>
-        <w:t xml:space="preserve">  =  α β′ </w:t>
-      </w:r>
-      <w:r>
-        <w:rPr>
-          <w:rFonts w:ascii="Calibri" w:cs="Calibri" w:eastAsia="Calibri" w:hAnsi="Calibri"/>
-          <w:b w:val="false"/>
-          <w:bCs w:val="false"/>
-          <w:i/>
-          <w:iCs/>
-          <w:sz w:val="22"/>
-          <w:szCs w:val="22"/>
-        </w:rPr>
-        <w:t xml:space="preserve">x</w:t>
-      </w:r>
-      <w:r>
-        <w:rPr>
-          <w:rFonts w:ascii="Calibri" w:cs="Calibri" w:eastAsia="Calibri" w:hAnsi="Calibri"/>
-          <w:b w:val="false"/>
-          <w:bCs w:val="false"/>
-          <w:i/>
-          <w:iCs/>
-          <w:sz w:val="22"/>
-          <w:szCs w:val="22"/>
-          <w:vertAlign w:val="subscript"/>
-        </w:rPr>
-        <w:t xml:space="preserve">t−1</w:t>
-      </w:r>
-      <w:r>
-        <w:rPr>
-          <w:rFonts w:ascii="Calibri" w:cs="Calibri" w:eastAsia="Calibri" w:hAnsi="Calibri"/>
-          <w:b w:val="false"/>
-          <w:bCs w:val="false"/>
-          <w:i w:val="false"/>
-          <w:iCs w:val="false"/>
-          <w:sz w:val="22"/>
-          <w:szCs w:val="22"/>
-        </w:rPr>
-        <w:t xml:space="preserve">  +  Σ</w:t>
-      </w:r>
-      <w:r>
-        <w:rPr>
-          <w:rFonts w:ascii="Calibri" w:cs="Calibri" w:eastAsia="Calibri" w:hAnsi="Calibri"/>
-          <w:b w:val="false"/>
-          <w:bCs w:val="false"/>
-          <w:i w:val="false"/>
-          <w:iCs w:val="false"/>
-          <w:sz w:val="22"/>
-          <w:szCs w:val="22"/>
-          <w:vertAlign w:val="subscript"/>
-        </w:rPr>
-        <w:t xml:space="preserve">i = 1</w:t>
-      </w:r>
-      <w:r>
-        <w:rPr>
-          <w:rFonts w:ascii="Calibri" w:cs="Calibri" w:eastAsia="Calibri" w:hAnsi="Calibri"/>
-          <w:b w:val="false"/>
-          <w:bCs w:val="false"/>
-          <w:i w:val="false"/>
-          <w:iCs w:val="false"/>
-          <w:sz w:val="22"/>
-          <w:szCs w:val="22"/>
-          <w:vertAlign w:val="superscript"/>
-        </w:rPr>
-        <w:t xml:space="preserve">k−1</w:t>
-      </w:r>
-      <w:r>
-        <w:rPr>
-          <w:rFonts w:ascii="Calibri" w:cs="Calibri" w:eastAsia="Calibri" w:hAnsi="Calibri"/>
-          <w:b w:val="false"/>
-          <w:bCs w:val="false"/>
-          <w:i w:val="false"/>
-          <w:iCs w:val="false"/>
-          <w:sz w:val="22"/>
-          <w:szCs w:val="22"/>
-        </w:rPr>
-        <w:t xml:space="preserve">  </w:t>
-      </w:r>
-      <w:r>
-        <w:rPr>
-          <w:rFonts w:ascii="Calibri" w:cs="Calibri" w:eastAsia="Calibri" w:hAnsi="Calibri"/>
-          <w:b w:val="false"/>
-          <w:bCs w:val="false"/>
-          <w:i/>
-          <w:iCs/>
-          <w:sz w:val="22"/>
-          <w:szCs w:val="22"/>
-        </w:rPr>
-        <w:t xml:space="preserve">Γ</w:t>
-      </w:r>
-      <w:r>
-        <w:rPr>
-          <w:rFonts w:ascii="Calibri" w:cs="Calibri" w:eastAsia="Calibri" w:hAnsi="Calibri"/>
-          <w:b w:val="false"/>
-          <w:bCs w:val="false"/>
-          <w:i/>
-          <w:iCs/>
-          <w:sz w:val="22"/>
-          <w:szCs w:val="22"/>
-          <w:vertAlign w:val="subscript"/>
-        </w:rPr>
-        <w:t xml:space="preserve">i</w:t>
-      </w:r>
-      <w:r>
-        <w:rPr>
-          <w:rFonts w:ascii="Calibri" w:cs="Calibri" w:eastAsia="Calibri" w:hAnsi="Calibri"/>
-          <w:b w:val="false"/>
-          <w:bCs w:val="false"/>
-          <w:i w:val="false"/>
-          <w:iCs w:val="false"/>
-          <w:sz w:val="22"/>
-          <w:szCs w:val="22"/>
-        </w:rPr>
-        <w:t xml:space="preserve"> Δ</w:t>
-      </w:r>
-      <w:r>
-        <w:rPr>
-          <w:rFonts w:ascii="Calibri" w:cs="Calibri" w:eastAsia="Calibri" w:hAnsi="Calibri"/>
-          <w:b w:val="false"/>
-          <w:bCs w:val="false"/>
-          <w:i/>
-          <w:iCs/>
-          <w:sz w:val="22"/>
-          <w:szCs w:val="22"/>
-        </w:rPr>
-        <w:t xml:space="preserve">x</w:t>
-      </w:r>
-      <w:r>
-        <w:rPr>
-          <w:rFonts w:ascii="Calibri" w:cs="Calibri" w:eastAsia="Calibri" w:hAnsi="Calibri"/>
-          <w:b w:val="false"/>
-          <w:bCs w:val="false"/>
-          <w:i/>
-          <w:iCs/>
-          <w:sz w:val="22"/>
-          <w:szCs w:val="22"/>
-          <w:vertAlign w:val="subscript"/>
-        </w:rPr>
-        <w:t xml:space="preserve">t−i</w:t>
-      </w:r>
-      <w:r>
-        <w:rPr>
-          <w:rFonts w:ascii="Calibri" w:cs="Calibri" w:eastAsia="Calibri" w:hAnsi="Calibri"/>
-          <w:b w:val="false"/>
-          <w:bCs w:val="false"/>
-          <w:i w:val="false"/>
-          <w:iCs w:val="false"/>
-          <w:sz w:val="22"/>
-          <w:szCs w:val="22"/>
-        </w:rPr>
-        <w:t xml:space="preserve">  +  δ </w:t>
-      </w:r>
-      <w:r>
-        <w:rPr>
-          <w:rFonts w:ascii="Calibri" w:cs="Calibri" w:eastAsia="Calibri" w:hAnsi="Calibri"/>
-          <w:b w:val="false"/>
-          <w:bCs w:val="false"/>
-          <w:i/>
-          <w:iCs/>
-          <w:sz w:val="22"/>
-          <w:szCs w:val="22"/>
-        </w:rPr>
-        <w:t xml:space="preserve">ỹ</w:t>
-      </w:r>
-      <w:r>
-        <w:rPr>
-          <w:rFonts w:ascii="Calibri" w:cs="Calibri" w:eastAsia="Calibri" w:hAnsi="Calibri"/>
-          <w:b w:val="false"/>
-          <w:bCs w:val="false"/>
-          <w:i/>
-          <w:iCs/>
-          <w:sz w:val="22"/>
-          <w:szCs w:val="22"/>
-          <w:vertAlign w:val="subscript"/>
-        </w:rPr>
-        <w:t xml:space="preserve">t</w:t>
-      </w:r>
-      <w:r>
-        <w:rPr>
-          <w:rFonts w:ascii="Calibri" w:cs="Calibri" w:eastAsia="Calibri" w:hAnsi="Calibri"/>
-          <w:b w:val="false"/>
-          <w:bCs w:val="false"/>
-          <w:i w:val="false"/>
-          <w:iCs w:val="false"/>
-          <w:sz w:val="22"/>
-          <w:szCs w:val="22"/>
-        </w:rPr>
-        <w:t xml:space="preserve">  +  </w:t>
-      </w:r>
-      <w:r>
-        <w:rPr>
-          <w:rFonts w:ascii="Calibri" w:cs="Calibri" w:eastAsia="Calibri" w:hAnsi="Calibri"/>
-          <w:b w:val="false"/>
-          <w:bCs w:val="false"/>
-          <w:i/>
-          <w:iCs/>
-          <w:sz w:val="22"/>
-          <w:szCs w:val="22"/>
-        </w:rPr>
-        <w:t xml:space="preserve">ε</w:t>
-      </w:r>
-      <w:r>
-        <w:rPr>
-          <w:rFonts w:ascii="Calibri" w:cs="Calibri" w:eastAsia="Calibri" w:hAnsi="Calibri"/>
-          <w:b w:val="false"/>
-          <w:bCs w:val="false"/>
-          <w:i/>
-          <w:iCs/>
-          <w:sz w:val="22"/>
-          <w:szCs w:val="22"/>
-          <w:vertAlign w:val="subscript"/>
-        </w:rPr>
-        <w:t xml:space="preserve">t</w:t>
-      </w:r>
-    </w:p>
-    <w:p>
-      <w:pPr>
-        <w:spacing w:after="140" w:line="300"/>
-        <w:ind w:firstLine="431"/>
-        <w:jc w:val="both"/>
-      </w:pPr>
-      <w:r>
-        <w:rPr>
-          <w:rFonts w:ascii="Calibri" w:cs="Calibri" w:eastAsia="Calibri" w:hAnsi="Calibri"/>
-          <w:b w:val="false"/>
-          <w:bCs w:val="false"/>
-          <w:i w:val="false"/>
-          <w:iCs w:val="false"/>
-          <w:sz w:val="22"/>
-          <w:szCs w:val="22"/>
-        </w:rPr>
-        <w:t xml:space="preserve">El vector </w:t>
-      </w:r>
-      <w:r>
-        <w:rPr>
-          <w:rFonts w:ascii="Calibri" w:cs="Calibri" w:eastAsia="Calibri" w:hAnsi="Calibri"/>
-          <w:b w:val="false"/>
-          <w:bCs w:val="false"/>
-          <w:i/>
-          <w:iCs/>
-          <w:sz w:val="22"/>
-          <w:szCs w:val="22"/>
-        </w:rPr>
-        <w:t xml:space="preserve">β</w:t>
-      </w:r>
-      <w:r>
-        <w:rPr>
-          <w:rFonts w:ascii="Calibri" w:cs="Calibri" w:eastAsia="Calibri" w:hAnsi="Calibri"/>
-          <w:b w:val="false"/>
-          <w:bCs w:val="false"/>
-          <w:i w:val="false"/>
-          <w:iCs w:val="false"/>
-          <w:sz w:val="22"/>
-          <w:szCs w:val="22"/>
-        </w:rPr>
-        <w:t xml:space="preserve"> recoge la relación de largo plazo, normalizada sobre la deuda; el vector </w:t>
-      </w:r>
-      <w:r>
-        <w:rPr>
-          <w:rFonts w:ascii="Calibri" w:cs="Calibri" w:eastAsia="Calibri" w:hAnsi="Calibri"/>
-          <w:b w:val="false"/>
-          <w:bCs w:val="false"/>
-          <w:i/>
-          <w:iCs/>
-          <w:sz w:val="22"/>
-          <w:szCs w:val="22"/>
-        </w:rPr>
-        <w:t xml:space="preserve">α</w:t>
-      </w:r>
-      <w:r>
-        <w:rPr>
-          <w:rFonts w:ascii="Calibri" w:cs="Calibri" w:eastAsia="Calibri" w:hAnsi="Calibri"/>
-          <w:b w:val="false"/>
-          <w:bCs w:val="false"/>
-          <w:i w:val="false"/>
-          <w:iCs w:val="false"/>
-          <w:sz w:val="22"/>
-          <w:szCs w:val="22"/>
-        </w:rPr>
-        <w:t xml:space="preserve"> contiene las velocidades de ajuste de cada variable hacia el equilibrio. La brecha del producto entra como variable exógena estacionaria. El rango de cointegración se fija en uno; en la ventana ampliada esa imposición no es neutral, porque el contraste de Johansen es sensible a incluir o no el año 1999, y esa fragilidad se documenta en lugar de ocultarse.</w:t>
-      </w:r>
-    </w:p>
-    <w:p>
-      <w:pPr>
-        <w:pStyle w:val="Heading2"/>
-        <w:spacing w:after="100" w:before="240"/>
-      </w:pPr>
-      <w:r>
-        <w:rPr>
-          <w:rFonts w:ascii="Calibri" w:cs="Calibri" w:eastAsia="Calibri" w:hAnsi="Calibri"/>
-          <w:b/>
-          <w:bCs/>
-          <w:sz w:val="23"/>
-          <w:szCs w:val="23"/>
-        </w:rPr>
-        <w:t xml:space="preserve">4.3. VAR estructural restringido</w:t>
-      </w:r>
-    </w:p>
-    <w:p>
-      <w:pPr>
-        <w:spacing w:after="140" w:line="300"/>
-        <w:ind w:firstLine="431"/>
-        <w:jc w:val="both"/>
-      </w:pPr>
-      <w:r>
-        <w:rPr>
-          <w:rFonts w:ascii="Calibri" w:cs="Calibri" w:eastAsia="Calibri" w:hAnsi="Calibri"/>
-          <w:b w:val="false"/>
-          <w:bCs w:val="false"/>
-          <w:i w:val="false"/>
-          <w:iCs w:val="false"/>
-          <w:sz w:val="22"/>
-          <w:szCs w:val="22"/>
-        </w:rPr>
-        <w:t xml:space="preserve">Para identificar la transmisión de perturbaciones sin recurrir a un ordenamiento de Cholesky arbitrario, se estima un VAR estructural restringido sobre el vector de cinco variables, siguiendo el esquema de identificación contemporánea de Blanchard y Perotti (2002) y la restricción de acumulación de deuda de Favero y Giavazzi (2007). El sistema estructural es:</w:t>
-      </w:r>
-    </w:p>
-    <w:p>
-      <w:pPr>
-        <w:spacing w:after="150" w:before="110"/>
-        <w:jc w:val="center"/>
-      </w:pPr>
-      <w:r>
-        <w:rPr>
-          <w:rFonts w:ascii="Calibri" w:cs="Calibri" w:eastAsia="Calibri" w:hAnsi="Calibri"/>
-          <w:b w:val="false"/>
-          <w:bCs w:val="false"/>
-          <w:i/>
-          <w:iCs/>
-          <w:sz w:val="22"/>
-          <w:szCs w:val="22"/>
-        </w:rPr>
-        <w:t xml:space="preserve">A</w:t>
-      </w:r>
-      <w:r>
-        <w:rPr>
-          <w:rFonts w:ascii="Calibri" w:cs="Calibri" w:eastAsia="Calibri" w:hAnsi="Calibri"/>
-          <w:b w:val="false"/>
-          <w:bCs w:val="false"/>
-          <w:i/>
-          <w:iCs/>
-          <w:sz w:val="22"/>
-          <w:szCs w:val="22"/>
-          <w:vertAlign w:val="subscript"/>
-        </w:rPr>
-        <w:t xml:space="preserve">0</w:t>
-      </w:r>
-      <w:r>
-        <w:rPr>
-          <w:rFonts w:ascii="Calibri" w:cs="Calibri" w:eastAsia="Calibri" w:hAnsi="Calibri"/>
-          <w:b w:val="false"/>
-          <w:bCs w:val="false"/>
-          <w:i w:val="false"/>
-          <w:iCs w:val="false"/>
-          <w:sz w:val="22"/>
-          <w:szCs w:val="22"/>
-        </w:rPr>
-        <w:t xml:space="preserve"> </w:t>
-      </w:r>
-      <w:r>
-        <w:rPr>
-          <w:rFonts w:ascii="Calibri" w:cs="Calibri" w:eastAsia="Calibri" w:hAnsi="Calibri"/>
-          <w:b w:val="false"/>
-          <w:bCs w:val="false"/>
-          <w:i/>
-          <w:iCs/>
-          <w:sz w:val="22"/>
-          <w:szCs w:val="22"/>
-        </w:rPr>
-        <w:t xml:space="preserve">u</w:t>
-      </w:r>
-      <w:r>
-        <w:rPr>
-          <w:rFonts w:ascii="Calibri" w:cs="Calibri" w:eastAsia="Calibri" w:hAnsi="Calibri"/>
-          <w:b w:val="false"/>
-          <w:bCs w:val="false"/>
-          <w:i/>
-          <w:iCs/>
-          <w:sz w:val="22"/>
-          <w:szCs w:val="22"/>
-          <w:vertAlign w:val="subscript"/>
-        </w:rPr>
-        <w:t xml:space="preserve">t</w:t>
-      </w:r>
-      <w:r>
-        <w:rPr>
-          <w:rFonts w:ascii="Calibri" w:cs="Calibri" w:eastAsia="Calibri" w:hAnsi="Calibri"/>
-          <w:b w:val="false"/>
-          <w:bCs w:val="false"/>
-          <w:i w:val="false"/>
-          <w:iCs w:val="false"/>
-          <w:sz w:val="22"/>
-          <w:szCs w:val="22"/>
-        </w:rPr>
-        <w:t xml:space="preserve">  =  B </w:t>
-      </w:r>
-      <w:r>
-        <w:rPr>
-          <w:rFonts w:ascii="Calibri" w:cs="Calibri" w:eastAsia="Calibri" w:hAnsi="Calibri"/>
-          <w:b w:val="false"/>
-          <w:bCs w:val="false"/>
-          <w:i/>
-          <w:iCs/>
-          <w:sz w:val="22"/>
-          <w:szCs w:val="22"/>
-        </w:rPr>
-        <w:t xml:space="preserve">e</w:t>
-      </w:r>
-      <w:r>
-        <w:rPr>
-          <w:rFonts w:ascii="Calibri" w:cs="Calibri" w:eastAsia="Calibri" w:hAnsi="Calibri"/>
-          <w:b w:val="false"/>
-          <w:bCs w:val="false"/>
-          <w:i/>
-          <w:iCs/>
-          <w:sz w:val="22"/>
-          <w:szCs w:val="22"/>
-          <w:vertAlign w:val="subscript"/>
-        </w:rPr>
-        <w:t xml:space="preserve">t</w:t>
-      </w:r>
-      <w:r>
-        <w:rPr>
-          <w:rFonts w:ascii="Calibri" w:cs="Calibri" w:eastAsia="Calibri" w:hAnsi="Calibri"/>
-          <w:b w:val="false"/>
-          <w:bCs w:val="false"/>
-          <w:i w:val="false"/>
-          <w:iCs w:val="false"/>
-          <w:sz w:val="22"/>
-          <w:szCs w:val="22"/>
-        </w:rPr>
-        <w:t xml:space="preserve">     con     </w:t>
-      </w:r>
-      <w:r>
-        <w:rPr>
-          <w:rFonts w:ascii="Calibri" w:cs="Calibri" w:eastAsia="Calibri" w:hAnsi="Calibri"/>
-          <w:b w:val="false"/>
-          <w:bCs w:val="false"/>
-          <w:i/>
-          <w:iCs/>
-          <w:sz w:val="22"/>
-          <w:szCs w:val="22"/>
-        </w:rPr>
-        <w:t xml:space="preserve">Y</w:t>
-      </w:r>
-      <w:r>
-        <w:rPr>
-          <w:rFonts w:ascii="Calibri" w:cs="Calibri" w:eastAsia="Calibri" w:hAnsi="Calibri"/>
-          <w:b w:val="false"/>
-          <w:bCs w:val="false"/>
-          <w:i/>
-          <w:iCs/>
-          <w:sz w:val="22"/>
-          <w:szCs w:val="22"/>
-          <w:vertAlign w:val="subscript"/>
-        </w:rPr>
-        <w:t xml:space="preserve">t</w:t>
-      </w:r>
-      <w:r>
-        <w:rPr>
-          <w:rFonts w:ascii="Calibri" w:cs="Calibri" w:eastAsia="Calibri" w:hAnsi="Calibri"/>
-          <w:b w:val="false"/>
-          <w:bCs w:val="false"/>
-          <w:i w:val="false"/>
-          <w:iCs w:val="false"/>
-          <w:sz w:val="22"/>
-          <w:szCs w:val="22"/>
-        </w:rPr>
-        <w:t xml:space="preserve">  =  ( ỹ</w:t>
-      </w:r>
-      <w:r>
-        <w:rPr>
-          <w:rFonts w:ascii="Calibri" w:cs="Calibri" w:eastAsia="Calibri" w:hAnsi="Calibri"/>
-          <w:b w:val="false"/>
-          <w:bCs w:val="false"/>
-          <w:i/>
-          <w:iCs/>
-          <w:sz w:val="22"/>
-          <w:szCs w:val="22"/>
-          <w:vertAlign w:val="subscript"/>
-        </w:rPr>
-        <w:t xml:space="preserve">t</w:t>
-      </w:r>
-      <w:r>
-        <w:rPr>
-          <w:rFonts w:ascii="Calibri" w:cs="Calibri" w:eastAsia="Calibri" w:hAnsi="Calibri"/>
-          <w:b w:val="false"/>
-          <w:bCs w:val="false"/>
-          <w:i w:val="false"/>
-          <w:iCs w:val="false"/>
-          <w:sz w:val="22"/>
-          <w:szCs w:val="22"/>
-        </w:rPr>
-        <w:t xml:space="preserve">, pb</w:t>
-      </w:r>
-      <w:r>
-        <w:rPr>
-          <w:rFonts w:ascii="Calibri" w:cs="Calibri" w:eastAsia="Calibri" w:hAnsi="Calibri"/>
-          <w:b w:val="false"/>
-          <w:bCs w:val="false"/>
-          <w:i/>
-          <w:iCs/>
-          <w:sz w:val="22"/>
-          <w:szCs w:val="22"/>
-          <w:vertAlign w:val="subscript"/>
-        </w:rPr>
-        <w:t xml:space="preserve">t</w:t>
-      </w:r>
-      <w:r>
-        <w:rPr>
-          <w:rFonts w:ascii="Calibri" w:cs="Calibri" w:eastAsia="Calibri" w:hAnsi="Calibri"/>
-          <w:b w:val="false"/>
-          <w:bCs w:val="false"/>
-          <w:i w:val="false"/>
-          <w:iCs w:val="false"/>
-          <w:sz w:val="22"/>
-          <w:szCs w:val="22"/>
-        </w:rPr>
-        <w:t xml:space="preserve">, EMBI</w:t>
-      </w:r>
-      <w:r>
-        <w:rPr>
-          <w:rFonts w:ascii="Calibri" w:cs="Calibri" w:eastAsia="Calibri" w:hAnsi="Calibri"/>
-          <w:b w:val="false"/>
-          <w:bCs w:val="false"/>
-          <w:i/>
-          <w:iCs/>
-          <w:sz w:val="22"/>
-          <w:szCs w:val="22"/>
-          <w:vertAlign w:val="subscript"/>
-        </w:rPr>
-        <w:t xml:space="preserve">t</w:t>
-      </w:r>
-      <w:r>
-        <w:rPr>
-          <w:rFonts w:ascii="Calibri" w:cs="Calibri" w:eastAsia="Calibri" w:hAnsi="Calibri"/>
-          <w:b w:val="false"/>
-          <w:bCs w:val="false"/>
-          <w:i w:val="false"/>
-          <w:iCs w:val="false"/>
-          <w:sz w:val="22"/>
-          <w:szCs w:val="22"/>
-        </w:rPr>
-        <w:t xml:space="preserve">, TCRM</w:t>
-      </w:r>
-      <w:r>
-        <w:rPr>
-          <w:rFonts w:ascii="Calibri" w:cs="Calibri" w:eastAsia="Calibri" w:hAnsi="Calibri"/>
-          <w:b w:val="false"/>
-          <w:bCs w:val="false"/>
-          <w:i/>
-          <w:iCs/>
-          <w:sz w:val="22"/>
-          <w:szCs w:val="22"/>
-          <w:vertAlign w:val="subscript"/>
-        </w:rPr>
-        <w:t xml:space="preserve">t</w:t>
-      </w:r>
-      <w:r>
-        <w:rPr>
-          <w:rFonts w:ascii="Calibri" w:cs="Calibri" w:eastAsia="Calibri" w:hAnsi="Calibri"/>
-          <w:b w:val="false"/>
-          <w:bCs w:val="false"/>
-          <w:i w:val="false"/>
-          <w:iCs w:val="false"/>
-          <w:sz w:val="22"/>
-          <w:szCs w:val="22"/>
-        </w:rPr>
-        <w:t xml:space="preserve">, d</w:t>
-      </w:r>
-      <w:r>
-        <w:rPr>
-          <w:rFonts w:ascii="Calibri" w:cs="Calibri" w:eastAsia="Calibri" w:hAnsi="Calibri"/>
-          <w:b w:val="false"/>
-          <w:bCs w:val="false"/>
-          <w:i/>
-          <w:iCs/>
-          <w:sz w:val="22"/>
-          <w:szCs w:val="22"/>
-          <w:vertAlign w:val="subscript"/>
-        </w:rPr>
-        <w:t xml:space="preserve">t</w:t>
-      </w:r>
-      <w:r>
-        <w:rPr>
-          <w:rFonts w:ascii="Calibri" w:cs="Calibri" w:eastAsia="Calibri" w:hAnsi="Calibri"/>
-          <w:b w:val="false"/>
-          <w:bCs w:val="false"/>
-          <w:i w:val="false"/>
-          <w:iCs w:val="false"/>
-          <w:sz w:val="22"/>
-          <w:szCs w:val="22"/>
-        </w:rPr>
-        <w:t xml:space="preserve"> )′</w:t>
+        <w:drawing>
+          <wp:inline distT="0" distB="0" distL="0" distR="0">
+            <wp:extent cx="5715000" cy="333375"/>
+            <wp:effectExtent t="0" r="0" b="0" l="0"/>
+            <wp:docPr id="1" name="" descr="" title=""/>
+            <wp:cNvGraphicFramePr>
+              <a:graphicFrameLocks xmlns:a="http://schemas.openxmlformats.org/drawingml/2006/main" noChangeAspect="1"/>
+            </wp:cNvGraphicFramePr>
+            <a:graphic xmlns:a="http://schemas.openxmlformats.org/drawingml/2006/main">
+              <a:graphicData uri="http://schemas.openxmlformats.org/drawingml/2006/picture">
+                <pic:pic xmlns:pic="http://schemas.openxmlformats.org/drawingml/2006/picture">
+                  <pic:nvPicPr>
+                    <pic:cNvPr id="0" name="" descr=""/>
+                    <pic:cNvPicPr>
+                      <a:picLocks noChangeAspect="1" noChangeArrowheads="1"/>
+                    </pic:cNvPicPr>
+                  </pic:nvPicPr>
+                  <pic:blipFill>
+                    <a:blip r:embed="rId12" cstate="none"/>
+                    <a:srcRect/>
+                    <a:stretch>
+                      <a:fillRect/>
+                    </a:stretch>
+                  </pic:blipFill>
+                  <pic:spPr bwMode="auto">
+                    <a:xfrm>
+                      <a:off x="0" y="0"/>
+                      <a:ext cx="5715000" cy="333375"/>
+                    </a:xfrm>
+                    <a:prstGeom prst="rect">
+                      <a:avLst/>
+                    </a:prstGeom>
+                  </pic:spPr>
+                </pic:pic>
+              </a:graphicData>
+            </a:graphic>
+          </wp:inline>
+        </w:drawing>
       </w:r>
     </w:p>
     <w:p>
@@ -2954,9 +2002,68 @@
     </w:p>
     <w:p>
       <w:pPr>
-        <w:spacing w:after="150" w:before="110"/>
+        <w:spacing w:after="170" w:before="140"/>
         <w:jc w:val="center"/>
       </w:pPr>
+      <w:r>
+        <w:drawing>
+          <wp:inline distT="0" distB="0" distL="0" distR="0">
+            <wp:extent cx="4714875" cy="990600"/>
+            <wp:effectExtent t="0" r="0" b="0" l="0"/>
+            <wp:docPr id="1" name="" descr="" title=""/>
+            <wp:cNvGraphicFramePr>
+              <a:graphicFrameLocks xmlns:a="http://schemas.openxmlformats.org/drawingml/2006/main" noChangeAspect="1"/>
+            </wp:cNvGraphicFramePr>
+            <a:graphic xmlns:a="http://schemas.openxmlformats.org/drawingml/2006/main">
+              <a:graphicData uri="http://schemas.openxmlformats.org/drawingml/2006/picture">
+                <pic:pic xmlns:pic="http://schemas.openxmlformats.org/drawingml/2006/picture">
+                  <pic:nvPicPr>
+                    <pic:cNvPr id="0" name="" descr=""/>
+                    <pic:cNvPicPr>
+                      <a:picLocks noChangeAspect="1" noChangeArrowheads="1"/>
+                    </pic:cNvPicPr>
+                  </pic:nvPicPr>
+                  <pic:blipFill>
+                    <a:blip r:embed="rId13" cstate="none"/>
+                    <a:srcRect/>
+                    <a:stretch>
+                      <a:fillRect/>
+                    </a:stretch>
+                  </pic:blipFill>
+                  <pic:spPr bwMode="auto">
+                    <a:xfrm>
+                      <a:off x="0" y="0"/>
+                      <a:ext cx="4714875" cy="990600"/>
+                    </a:xfrm>
+                    <a:prstGeom prst="rect">
+                      <a:avLst/>
+                    </a:prstGeom>
+                  </pic:spPr>
+                </pic:pic>
+              </a:graphicData>
+            </a:graphic>
+          </wp:inline>
+        </w:drawing>
+      </w:r>
+    </w:p>
+    <w:p>
+      <w:pPr>
+        <w:spacing w:after="140" w:line="300"/>
+        <w:ind w:firstLine="431"/>
+        <w:jc w:val="both"/>
+      </w:pPr>
+      <w:r>
+        <w:rPr>
+          <w:rFonts w:ascii="Calibri" w:cs="Calibri" w:eastAsia="Calibri" w:hAnsi="Calibri"/>
+          <w:b w:val="false"/>
+          <w:bCs w:val="false"/>
+          <w:i w:val="false"/>
+          <w:iCs w:val="false"/>
+          <w:sz w:val="22"/>
+          <w:szCs w:val="22"/>
+        </w:rPr>
+        <w:t xml:space="preserve">A partir de la matriz de impacto estructural estimada </w:t>
+      </w:r>
       <w:r>
         <w:rPr>
           <w:rFonts w:ascii="Calibri" w:cs="Calibri" w:eastAsia="Calibri" w:hAnsi="Calibri"/>
@@ -2967,7 +2074,219 @@
           <w:sz w:val="22"/>
           <w:szCs w:val="22"/>
         </w:rPr>
-        <w:t xml:space="preserve">d</w:t>
+        <w:t xml:space="preserve">S = A0⁻¹ B</w:t>
+      </w:r>
+      <w:r>
+        <w:rPr>
+          <w:rFonts w:ascii="Calibri" w:cs="Calibri" w:eastAsia="Calibri" w:hAnsi="Calibri"/>
+          <w:b w:val="false"/>
+          <w:bCs w:val="false"/>
+          <w:i w:val="false"/>
+          <w:iCs w:val="false"/>
+          <w:sz w:val="22"/>
+          <w:szCs w:val="22"/>
+        </w:rPr>
+        <w:t xml:space="preserve"> se calculan las funciones de impulso-respuesta con bandas bootstrap al 95 % (1.000 réplicas) y la descomposición de varianza del error de pronóstico.</w:t>
+      </w:r>
+    </w:p>
+    <w:p>
+      <w:pPr>
+        <w:spacing w:after="140" w:line="300"/>
+        <w:ind w:firstLine="431"/>
+        <w:jc w:val="both"/>
+      </w:pPr>
+      <w:r>
+        <w:rPr>
+          <w:rFonts w:ascii="Calibri" w:cs="Calibri" w:eastAsia="Calibri" w:hAnsi="Calibri"/>
+          <w:b w:val="false"/>
+          <w:bCs w:val="false"/>
+          <w:i w:val="false"/>
+          <w:iCs w:val="false"/>
+          <w:sz w:val="22"/>
+          <w:szCs w:val="22"/>
+        </w:rPr>
+        <w:t xml:space="preserve">DOLS no se descarta: se conserva como comparación metodológica sobre la ventana original, con la especificación de Stock y Watson (1993), aumentada con cuatro adelantos y rezagos de la primera diferencia de la deuda:</w:t>
+      </w:r>
+    </w:p>
+    <w:p>
+      <w:pPr>
+        <w:spacing w:after="170" w:before="140"/>
+        <w:jc w:val="center"/>
+      </w:pPr>
+      <w:r>
+        <w:drawing>
+          <wp:inline distT="0" distB="0" distL="0" distR="0">
+            <wp:extent cx="5715000" cy="952500"/>
+            <wp:effectExtent t="0" r="0" b="0" l="0"/>
+            <wp:docPr id="1" name="" descr="" title=""/>
+            <wp:cNvGraphicFramePr>
+              <a:graphicFrameLocks xmlns:a="http://schemas.openxmlformats.org/drawingml/2006/main" noChangeAspect="1"/>
+            </wp:cNvGraphicFramePr>
+            <a:graphic xmlns:a="http://schemas.openxmlformats.org/drawingml/2006/main">
+              <a:graphicData uri="http://schemas.openxmlformats.org/drawingml/2006/picture">
+                <pic:pic xmlns:pic="http://schemas.openxmlformats.org/drawingml/2006/picture">
+                  <pic:nvPicPr>
+                    <pic:cNvPr id="0" name="" descr=""/>
+                    <pic:cNvPicPr>
+                      <a:picLocks noChangeAspect="1" noChangeArrowheads="1"/>
+                    </pic:cNvPicPr>
+                  </pic:nvPicPr>
+                  <pic:blipFill>
+                    <a:blip r:embed="rId14" cstate="none"/>
+                    <a:srcRect/>
+                    <a:stretch>
+                      <a:fillRect/>
+                    </a:stretch>
+                  </pic:blipFill>
+                  <pic:spPr bwMode="auto">
+                    <a:xfrm>
+                      <a:off x="0" y="0"/>
+                      <a:ext cx="5715000" cy="952500"/>
+                    </a:xfrm>
+                    <a:prstGeom prst="rect">
+                      <a:avLst/>
+                    </a:prstGeom>
+                  </pic:spPr>
+                </pic:pic>
+              </a:graphicData>
+            </a:graphic>
+          </wp:inline>
+        </w:drawing>
+      </w:r>
+    </w:p>
+    <w:p>
+      <w:pPr>
+        <w:pStyle w:val="Heading2"/>
+        <w:spacing w:after="100" w:before="240"/>
+      </w:pPr>
+      <w:r>
+        <w:rPr>
+          <w:rFonts w:ascii="Calibri" w:cs="Calibri" w:eastAsia="Calibri" w:hAnsi="Calibri"/>
+          <w:b/>
+          <w:bCs/>
+          <w:sz w:val="23"/>
+          <w:szCs w:val="23"/>
+        </w:rPr>
+        <w:t xml:space="preserve">4.4. Corrección de la endogeneidad del riesgo soberano</w:t>
+      </w:r>
+    </w:p>
+    <w:p>
+      <w:pPr>
+        <w:spacing w:after="140" w:line="300"/>
+        <w:ind w:firstLine="431"/>
+        <w:jc w:val="both"/>
+      </w:pPr>
+      <w:r>
+        <w:rPr>
+          <w:rFonts w:ascii="Calibri" w:cs="Calibri" w:eastAsia="Calibri" w:hAnsi="Calibri"/>
+          <w:b w:val="false"/>
+          <w:bCs w:val="false"/>
+          <w:i w:val="false"/>
+          <w:iCs w:val="false"/>
+          <w:sz w:val="22"/>
+          <w:szCs w:val="22"/>
+        </w:rPr>
+        <w:t xml:space="preserve">La teoría predice causalidad inversa entre el resultado fiscal y el riesgo soberano: un deterioro fiscal eleva la prima que exigen los acreedores, y una suba exógena del EMBI+ encarece el financiamiento y presiona las cuentas públicas. Se instrumenta el EMBI+ con el índice de volatilidad global VIX y un diferencial de riesgo soberano regional, y se estima por variables instrumentales en dos etapas. La fuerza del diseño se evalúa con el estadístico F de primera etapa (umbral de Staiger y Stock: mayor que 10), el test de endogeneidad de Wu-Hausman y el test de sobreidentificación de Sargan.</w:t>
+      </w:r>
+    </w:p>
+    <w:p>
+      <w:pPr>
+        <w:pStyle w:val="Heading2"/>
+        <w:spacing w:after="100" w:before="240"/>
+      </w:pPr>
+      <w:r>
+        <w:rPr>
+          <w:rFonts w:ascii="Calibri" w:cs="Calibri" w:eastAsia="Calibri" w:hAnsi="Calibri"/>
+          <w:b/>
+          <w:bCs/>
+          <w:sz w:val="23"/>
+          <w:szCs w:val="23"/>
+        </w:rPr>
+        <w:t xml:space="preserve">4.5. Modelos de umbral y fatiga fiscal</w:t>
+      </w:r>
+    </w:p>
+    <w:p>
+      <w:pPr>
+        <w:spacing w:after="140" w:line="300"/>
+        <w:ind w:firstLine="431"/>
+        <w:jc w:val="both"/>
+      </w:pPr>
+      <w:r>
+        <w:rPr>
+          <w:rFonts w:ascii="Calibri" w:cs="Calibri" w:eastAsia="Calibri" w:hAnsi="Calibri"/>
+          <w:b w:val="false"/>
+          <w:bCs w:val="false"/>
+          <w:i w:val="false"/>
+          <w:iCs w:val="false"/>
+          <w:sz w:val="22"/>
+          <w:szCs w:val="22"/>
+        </w:rPr>
+        <w:t xml:space="preserve">El contraste canónico de fatiga fiscal es el modelo de umbral de Hansen (1999), con punto de quiebre determinado por el nivel de riesgo soberano:</w:t>
+      </w:r>
+    </w:p>
+    <w:p>
+      <w:pPr>
+        <w:spacing w:after="170" w:before="140"/>
+        <w:jc w:val="center"/>
+      </w:pPr>
+      <w:r>
+        <w:drawing>
+          <wp:inline distT="0" distB="0" distL="0" distR="0">
+            <wp:extent cx="5715000" cy="257175"/>
+            <wp:effectExtent t="0" r="0" b="0" l="0"/>
+            <wp:docPr id="1" name="" descr="" title=""/>
+            <wp:cNvGraphicFramePr>
+              <a:graphicFrameLocks xmlns:a="http://schemas.openxmlformats.org/drawingml/2006/main" noChangeAspect="1"/>
+            </wp:cNvGraphicFramePr>
+            <a:graphic xmlns:a="http://schemas.openxmlformats.org/drawingml/2006/main">
+              <a:graphicData uri="http://schemas.openxmlformats.org/drawingml/2006/picture">
+                <pic:pic xmlns:pic="http://schemas.openxmlformats.org/drawingml/2006/picture">
+                  <pic:nvPicPr>
+                    <pic:cNvPr id="0" name="" descr=""/>
+                    <pic:cNvPicPr>
+                      <a:picLocks noChangeAspect="1" noChangeArrowheads="1"/>
+                    </pic:cNvPicPr>
+                  </pic:nvPicPr>
+                  <pic:blipFill>
+                    <a:blip r:embed="rId15" cstate="none"/>
+                    <a:srcRect/>
+                    <a:stretch>
+                      <a:fillRect/>
+                    </a:stretch>
+                  </pic:blipFill>
+                  <pic:spPr bwMode="auto">
+                    <a:xfrm>
+                      <a:off x="0" y="0"/>
+                      <a:ext cx="5715000" cy="257175"/>
+                    </a:xfrm>
+                    <a:prstGeom prst="rect">
+                      <a:avLst/>
+                    </a:prstGeom>
+                  </pic:spPr>
+                </pic:pic>
+              </a:graphicData>
+            </a:graphic>
+          </wp:inline>
+        </w:drawing>
+      </w:r>
+    </w:p>
+    <w:p>
+      <w:pPr>
+        <w:spacing w:after="140" w:line="300"/>
+        <w:ind w:firstLine="431"/>
+        <w:jc w:val="both"/>
+      </w:pPr>
+      <w:r>
+        <w:rPr>
+          <w:rFonts w:ascii="Calibri" w:cs="Calibri" w:eastAsia="Calibri" w:hAnsi="Calibri"/>
+          <w:b w:val="false"/>
+          <w:bCs w:val="false"/>
+          <w:i w:val="false"/>
+          <w:iCs w:val="false"/>
+          <w:sz w:val="22"/>
+          <w:szCs w:val="22"/>
+        </w:rPr>
+        <w:t xml:space="preserve">El umbral óptimo </w:t>
       </w:r>
       <w:r>
         <w:rPr>
@@ -2978,9 +2297,8 @@
           <w:iCs/>
           <w:sz w:val="22"/>
           <w:szCs w:val="22"/>
-          <w:vertAlign w:val="subscript"/>
-        </w:rPr>
-        <w:t xml:space="preserve">t</w:t>
+        </w:rPr>
+        <w:t xml:space="preserve">τ*</w:t>
       </w:r>
       <w:r>
         <w:rPr>
@@ -2992,7 +2310,7 @@
           <w:sz w:val="22"/>
           <w:szCs w:val="22"/>
         </w:rPr>
-        <w:t xml:space="preserve">  =  [ ( 1 + </w:t>
+        <w:t xml:space="preserve"> se estima por mínima suma de cuadrados residuales sobre una grilla de percentiles de la distribución empírica del EMBI+. La significatividad del quiebre se contrasta con el estadístico Sup-LM, cuya distribución bajo linealidad se aproxima por remuestreo con 1.000 réplicas (Hansen, 2000). El análisis se extiende al marco multivariado con el Threshold VECM de Hansen y Seo (2002), que permite que las velocidades de ajuste del vector </w:t>
       </w:r>
       <w:r>
         <w:rPr>
@@ -3004,20 +2322,7 @@
           <w:sz w:val="22"/>
           <w:szCs w:val="22"/>
         </w:rPr>
-        <w:t xml:space="preserve">r</w:t>
-      </w:r>
-      <w:r>
-        <w:rPr>
-          <w:rFonts w:ascii="Calibri" w:cs="Calibri" w:eastAsia="Calibri" w:hAnsi="Calibri"/>
-          <w:b w:val="false"/>
-          <w:bCs w:val="false"/>
-          <w:i/>
-          <w:iCs/>
-          <w:sz w:val="22"/>
-          <w:szCs w:val="22"/>
-          <w:vertAlign w:val="subscript"/>
-        </w:rPr>
-        <w:t xml:space="preserve">t</w:t>
+        <w:t xml:space="preserve">α</w:t>
       </w:r>
       <w:r>
         <w:rPr>
@@ -3029,33 +2334,31 @@
           <w:sz w:val="22"/>
           <w:szCs w:val="22"/>
         </w:rPr>
-        <w:t xml:space="preserve"> ) / ( 1 + </w:t>
-      </w:r>
-      <w:r>
-        <w:rPr>
-          <w:rFonts w:ascii="Calibri" w:cs="Calibri" w:eastAsia="Calibri" w:hAnsi="Calibri"/>
-          <w:b w:val="false"/>
-          <w:bCs w:val="false"/>
-          <w:i/>
-          <w:iCs/>
-          <w:sz w:val="22"/>
-          <w:szCs w:val="22"/>
-        </w:rPr>
-        <w:t xml:space="preserve">g</w:t>
-      </w:r>
-      <w:r>
-        <w:rPr>
-          <w:rFonts w:ascii="Calibri" w:cs="Calibri" w:eastAsia="Calibri" w:hAnsi="Calibri"/>
-          <w:b w:val="false"/>
-          <w:bCs w:val="false"/>
-          <w:i/>
-          <w:iCs/>
-          <w:sz w:val="22"/>
-          <w:szCs w:val="22"/>
-          <w:vertAlign w:val="subscript"/>
-        </w:rPr>
-        <w:t xml:space="preserve">t</w:t>
-      </w:r>
+        <w:t xml:space="preserve"> conmuten de régimen según el estado del mercado financiero.</w:t>
+      </w:r>
+    </w:p>
+    <w:p>
+      <w:pPr>
+        <w:pStyle w:val="Heading2"/>
+        <w:spacing w:after="100" w:before="240"/>
+      </w:pPr>
+      <w:r>
+        <w:rPr>
+          <w:rFonts w:ascii="Calibri" w:cs="Calibri" w:eastAsia="Calibri" w:hAnsi="Calibri"/>
+          <w:b/>
+          <w:bCs/>
+          <w:sz w:val="23"/>
+          <w:szCs w:val="23"/>
+        </w:rPr>
+        <w:t xml:space="preserve">4.6. Simulación estocástica y proceso CIR</w:t>
+      </w:r>
+    </w:p>
+    <w:p>
+      <w:pPr>
+        <w:spacing w:after="140" w:line="300"/>
+        <w:ind w:firstLine="431"/>
+        <w:jc w:val="both"/>
+      </w:pPr>
       <w:r>
         <w:rPr>
           <w:rFonts w:ascii="Calibri" w:cs="Calibri" w:eastAsia="Calibri" w:hAnsi="Calibri"/>
@@ -3066,1015 +2369,53 @@
           <w:sz w:val="22"/>
           <w:szCs w:val="22"/>
         </w:rPr>
-        <w:t xml:space="preserve"> ) ] </w:t>
-      </w:r>
-      <w:r>
-        <w:rPr>
-          <w:rFonts w:ascii="Calibri" w:cs="Calibri" w:eastAsia="Calibri" w:hAnsi="Calibri"/>
-          <w:b w:val="false"/>
-          <w:bCs w:val="false"/>
-          <w:i/>
-          <w:iCs/>
-          <w:sz w:val="22"/>
-          <w:szCs w:val="22"/>
-        </w:rPr>
-        <w:t xml:space="preserve">d</w:t>
-      </w:r>
-      <w:r>
-        <w:rPr>
-          <w:rFonts w:ascii="Calibri" w:cs="Calibri" w:eastAsia="Calibri" w:hAnsi="Calibri"/>
-          <w:b w:val="false"/>
-          <w:bCs w:val="false"/>
-          <w:i/>
-          <w:iCs/>
-          <w:sz w:val="22"/>
-          <w:szCs w:val="22"/>
-          <w:vertAlign w:val="subscript"/>
-        </w:rPr>
-        <w:t xml:space="preserve">t−1</w:t>
-      </w:r>
-      <w:r>
-        <w:rPr>
-          <w:rFonts w:ascii="Calibri" w:cs="Calibri" w:eastAsia="Calibri" w:hAnsi="Calibri"/>
-          <w:b w:val="false"/>
-          <w:bCs w:val="false"/>
-          <w:i w:val="false"/>
-          <w:iCs w:val="false"/>
-          <w:sz w:val="22"/>
-          <w:szCs w:val="22"/>
-        </w:rPr>
-        <w:t xml:space="preserve">  −  </w:t>
-      </w:r>
-      <w:r>
-        <w:rPr>
-          <w:rFonts w:ascii="Calibri" w:cs="Calibri" w:eastAsia="Calibri" w:hAnsi="Calibri"/>
-          <w:b w:val="false"/>
-          <w:bCs w:val="false"/>
-          <w:i/>
-          <w:iCs/>
-          <w:sz w:val="22"/>
-          <w:szCs w:val="22"/>
-        </w:rPr>
-        <w:t xml:space="preserve">pb</w:t>
-      </w:r>
-      <w:r>
-        <w:rPr>
-          <w:rFonts w:ascii="Calibri" w:cs="Calibri" w:eastAsia="Calibri" w:hAnsi="Calibri"/>
-          <w:b w:val="false"/>
-          <w:bCs w:val="false"/>
-          <w:i/>
-          <w:iCs/>
-          <w:sz w:val="22"/>
-          <w:szCs w:val="22"/>
-          <w:vertAlign w:val="subscript"/>
-        </w:rPr>
-        <w:t xml:space="preserve">t</w:t>
-      </w:r>
-      <w:r>
-        <w:rPr>
-          <w:rFonts w:ascii="Calibri" w:cs="Calibri" w:eastAsia="Calibri" w:hAnsi="Calibri"/>
-          <w:b w:val="false"/>
-          <w:bCs w:val="false"/>
-          <w:i w:val="false"/>
-          <w:iCs w:val="false"/>
-          <w:sz w:val="22"/>
-          <w:szCs w:val="22"/>
-        </w:rPr>
-        <w:t xml:space="preserve">  +  </w:t>
-      </w:r>
-      <w:r>
-        <w:rPr>
-          <w:rFonts w:ascii="Calibri" w:cs="Calibri" w:eastAsia="Calibri" w:hAnsi="Calibri"/>
-          <w:b w:val="false"/>
-          <w:bCs w:val="false"/>
-          <w:i/>
-          <w:iCs/>
-          <w:sz w:val="22"/>
-          <w:szCs w:val="22"/>
-        </w:rPr>
-        <w:t xml:space="preserve">sft</w:t>
-      </w:r>
-      <w:r>
-        <w:rPr>
-          <w:rFonts w:ascii="Calibri" w:cs="Calibri" w:eastAsia="Calibri" w:hAnsi="Calibri"/>
-          <w:b w:val="false"/>
-          <w:bCs w:val="false"/>
-          <w:i/>
-          <w:iCs/>
-          <w:sz w:val="22"/>
-          <w:szCs w:val="22"/>
-          <w:vertAlign w:val="subscript"/>
-        </w:rPr>
-        <w:t xml:space="preserve">t</w:t>
-      </w:r>
-    </w:p>
-    <w:p>
-      <w:pPr>
-        <w:spacing w:after="140" w:line="300"/>
-        <w:ind w:firstLine="431"/>
-        <w:jc w:val="both"/>
-      </w:pPr>
-      <w:r>
-        <w:rPr>
-          <w:rFonts w:ascii="Calibri" w:cs="Calibri" w:eastAsia="Calibri" w:hAnsi="Calibri"/>
-          <w:b w:val="false"/>
-          <w:bCs w:val="false"/>
-          <w:i w:val="false"/>
-          <w:iCs w:val="false"/>
-          <w:sz w:val="22"/>
-          <w:szCs w:val="22"/>
-        </w:rPr>
-        <w:t xml:space="preserve">A partir de la matriz de impacto estructural estimada </w:t>
-      </w:r>
-      <w:r>
-        <w:rPr>
-          <w:rFonts w:ascii="Calibri" w:cs="Calibri" w:eastAsia="Calibri" w:hAnsi="Calibri"/>
-          <w:b w:val="false"/>
-          <w:bCs w:val="false"/>
-          <w:i/>
-          <w:iCs/>
-          <w:sz w:val="22"/>
-          <w:szCs w:val="22"/>
-        </w:rPr>
-        <w:t xml:space="preserve">S = A0⁻¹ B</w:t>
-      </w:r>
-      <w:r>
-        <w:rPr>
-          <w:rFonts w:ascii="Calibri" w:cs="Calibri" w:eastAsia="Calibri" w:hAnsi="Calibri"/>
-          <w:b w:val="false"/>
-          <w:bCs w:val="false"/>
-          <w:i w:val="false"/>
-          <w:iCs w:val="false"/>
-          <w:sz w:val="22"/>
-          <w:szCs w:val="22"/>
-        </w:rPr>
-        <w:t xml:space="preserve"> se calculan las funciones de impulso-respuesta con bandas bootstrap al 95 % (1.000 réplicas) y la descomposición de varianza del error de pronóstico.</w:t>
-      </w:r>
-    </w:p>
-    <w:p>
-      <w:pPr>
-        <w:spacing w:after="140" w:line="300"/>
-        <w:ind w:firstLine="431"/>
-        <w:jc w:val="both"/>
-      </w:pPr>
-      <w:r>
-        <w:rPr>
-          <w:rFonts w:ascii="Calibri" w:cs="Calibri" w:eastAsia="Calibri" w:hAnsi="Calibri"/>
-          <w:b w:val="false"/>
-          <w:bCs w:val="false"/>
-          <w:i w:val="false"/>
-          <w:iCs w:val="false"/>
-          <w:sz w:val="22"/>
-          <w:szCs w:val="22"/>
-        </w:rPr>
-        <w:t xml:space="preserve">DOLS no se descarta: se conserva como comparación metodológica sobre la ventana original, con la especificación de Stock y Watson (1993), aumentada con cuatro adelantos y rezagos de la primera diferencia de la deuda:</w:t>
-      </w:r>
-    </w:p>
-    <w:p>
-      <w:pPr>
-        <w:spacing w:after="150" w:before="110"/>
+        <w:t xml:space="preserve">El análisis de sostenibilidad se resuelve con una simulación de Monte Carlo de 1.000 iteraciones en la que las variables fundamentales reciben perturbaciones de una distribución t de Student multivariada con ν ≈ 4,8 grados de libertad —colas pesadas, calibradas a partir de la curtosis histórica— acopladas a correlaciones dinámicas. La tasa de refinanciación externa se dota de consistencia con la teoría de estructura temporal modelando el riesgo soberano como un proceso de difusión con reversión a la media (Cox, Ingersoll y Ross, 1985):</w:t>
+      </w:r>
+    </w:p>
+    <w:p>
+      <w:pPr>
+        <w:spacing w:after="170" w:before="140"/>
         <w:jc w:val="center"/>
       </w:pPr>
       <w:r>
-        <w:rPr>
-          <w:rFonts w:ascii="Calibri" w:cs="Calibri" w:eastAsia="Calibri" w:hAnsi="Calibri"/>
-          <w:b w:val="false"/>
-          <w:bCs w:val="false"/>
-          <w:i/>
-          <w:iCs/>
-          <w:sz w:val="22"/>
-          <w:szCs w:val="22"/>
-        </w:rPr>
-        <w:t xml:space="preserve">pb</w:t>
-      </w:r>
-      <w:r>
-        <w:rPr>
-          <w:rFonts w:ascii="Calibri" w:cs="Calibri" w:eastAsia="Calibri" w:hAnsi="Calibri"/>
-          <w:b w:val="false"/>
-          <w:bCs w:val="false"/>
-          <w:i/>
-          <w:iCs/>
-          <w:sz w:val="22"/>
-          <w:szCs w:val="22"/>
-          <w:vertAlign w:val="subscript"/>
-        </w:rPr>
-        <w:t xml:space="preserve">t</w:t>
-      </w:r>
-      <w:r>
-        <w:rPr>
-          <w:rFonts w:ascii="Calibri" w:cs="Calibri" w:eastAsia="Calibri" w:hAnsi="Calibri"/>
-          <w:b w:val="false"/>
-          <w:bCs w:val="false"/>
-          <w:i w:val="false"/>
-          <w:iCs w:val="false"/>
-          <w:sz w:val="22"/>
-          <w:szCs w:val="22"/>
-        </w:rPr>
-        <w:t xml:space="preserve">  =  α  +  ρ </w:t>
-      </w:r>
-      <w:r>
-        <w:rPr>
-          <w:rFonts w:ascii="Calibri" w:cs="Calibri" w:eastAsia="Calibri" w:hAnsi="Calibri"/>
-          <w:b w:val="false"/>
-          <w:bCs w:val="false"/>
-          <w:i/>
-          <w:iCs/>
-          <w:sz w:val="22"/>
-          <w:szCs w:val="22"/>
-        </w:rPr>
-        <w:t xml:space="preserve">d</w:t>
-      </w:r>
-      <w:r>
-        <w:rPr>
-          <w:rFonts w:ascii="Calibri" w:cs="Calibri" w:eastAsia="Calibri" w:hAnsi="Calibri"/>
-          <w:b w:val="false"/>
-          <w:bCs w:val="false"/>
-          <w:i/>
-          <w:iCs/>
-          <w:sz w:val="22"/>
-          <w:szCs w:val="22"/>
-          <w:vertAlign w:val="subscript"/>
-        </w:rPr>
-        <w:t xml:space="preserve">t−1</w:t>
-      </w:r>
-      <w:r>
-        <w:rPr>
-          <w:rFonts w:ascii="Calibri" w:cs="Calibri" w:eastAsia="Calibri" w:hAnsi="Calibri"/>
-          <w:b w:val="false"/>
-          <w:bCs w:val="false"/>
-          <w:i w:val="false"/>
-          <w:iCs w:val="false"/>
-          <w:sz w:val="22"/>
-          <w:szCs w:val="22"/>
-        </w:rPr>
-        <w:t xml:space="preserve">  +  γ </w:t>
-      </w:r>
-      <w:r>
-        <w:rPr>
-          <w:rFonts w:ascii="Calibri" w:cs="Calibri" w:eastAsia="Calibri" w:hAnsi="Calibri"/>
-          <w:b w:val="false"/>
-          <w:bCs w:val="false"/>
-          <w:i/>
-          <w:iCs/>
-          <w:sz w:val="22"/>
-          <w:szCs w:val="22"/>
-        </w:rPr>
-        <w:t xml:space="preserve">ỹ</w:t>
-      </w:r>
-      <w:r>
-        <w:rPr>
-          <w:rFonts w:ascii="Calibri" w:cs="Calibri" w:eastAsia="Calibri" w:hAnsi="Calibri"/>
-          <w:b w:val="false"/>
-          <w:bCs w:val="false"/>
-          <w:i/>
-          <w:iCs/>
-          <w:sz w:val="22"/>
-          <w:szCs w:val="22"/>
-          <w:vertAlign w:val="subscript"/>
-        </w:rPr>
-        <w:t xml:space="preserve">t</w:t>
-      </w:r>
-      <w:r>
-        <w:rPr>
-          <w:rFonts w:ascii="Calibri" w:cs="Calibri" w:eastAsia="Calibri" w:hAnsi="Calibri"/>
-          <w:b w:val="false"/>
-          <w:bCs w:val="false"/>
-          <w:i w:val="false"/>
-          <w:iCs w:val="false"/>
-          <w:sz w:val="22"/>
-          <w:szCs w:val="22"/>
-        </w:rPr>
-        <w:t xml:space="preserve">  +  Σ</w:t>
-      </w:r>
-      <w:r>
-        <w:rPr>
-          <w:rFonts w:ascii="Calibri" w:cs="Calibri" w:eastAsia="Calibri" w:hAnsi="Calibri"/>
-          <w:b w:val="false"/>
-          <w:bCs w:val="false"/>
-          <w:i w:val="false"/>
-          <w:iCs w:val="false"/>
-          <w:sz w:val="22"/>
-          <w:szCs w:val="22"/>
-          <w:vertAlign w:val="subscript"/>
-        </w:rPr>
-        <w:t xml:space="preserve">j = −4</w:t>
-      </w:r>
-      <w:r>
-        <w:rPr>
-          <w:rFonts w:ascii="Calibri" w:cs="Calibri" w:eastAsia="Calibri" w:hAnsi="Calibri"/>
-          <w:b w:val="false"/>
-          <w:bCs w:val="false"/>
-          <w:i w:val="false"/>
-          <w:iCs w:val="false"/>
-          <w:sz w:val="22"/>
-          <w:szCs w:val="22"/>
-          <w:vertAlign w:val="superscript"/>
-        </w:rPr>
-        <w:t xml:space="preserve">4</w:t>
-      </w:r>
-      <w:r>
-        <w:rPr>
-          <w:rFonts w:ascii="Calibri" w:cs="Calibri" w:eastAsia="Calibri" w:hAnsi="Calibri"/>
-          <w:b w:val="false"/>
-          <w:bCs w:val="false"/>
-          <w:i w:val="false"/>
-          <w:iCs w:val="false"/>
-          <w:sz w:val="22"/>
-          <w:szCs w:val="22"/>
-        </w:rPr>
-        <w:t xml:space="preserve">  </w:t>
-      </w:r>
-      <w:r>
-        <w:rPr>
-          <w:rFonts w:ascii="Calibri" w:cs="Calibri" w:eastAsia="Calibri" w:hAnsi="Calibri"/>
-          <w:b w:val="false"/>
-          <w:bCs w:val="false"/>
-          <w:i/>
-          <w:iCs/>
-          <w:sz w:val="22"/>
-          <w:szCs w:val="22"/>
-        </w:rPr>
-        <w:t xml:space="preserve">φ</w:t>
-      </w:r>
-      <w:r>
-        <w:rPr>
-          <w:rFonts w:ascii="Calibri" w:cs="Calibri" w:eastAsia="Calibri" w:hAnsi="Calibri"/>
-          <w:b w:val="false"/>
-          <w:bCs w:val="false"/>
-          <w:i/>
-          <w:iCs/>
-          <w:sz w:val="22"/>
-          <w:szCs w:val="22"/>
-          <w:vertAlign w:val="subscript"/>
-        </w:rPr>
-        <w:t xml:space="preserve">j</w:t>
-      </w:r>
-      <w:r>
-        <w:rPr>
-          <w:rFonts w:ascii="Calibri" w:cs="Calibri" w:eastAsia="Calibri" w:hAnsi="Calibri"/>
-          <w:b w:val="false"/>
-          <w:bCs w:val="false"/>
-          <w:i w:val="false"/>
-          <w:iCs w:val="false"/>
-          <w:sz w:val="22"/>
-          <w:szCs w:val="22"/>
-        </w:rPr>
-        <w:t xml:space="preserve"> Δ</w:t>
-      </w:r>
-      <w:r>
-        <w:rPr>
-          <w:rFonts w:ascii="Calibri" w:cs="Calibri" w:eastAsia="Calibri" w:hAnsi="Calibri"/>
-          <w:b w:val="false"/>
-          <w:bCs w:val="false"/>
-          <w:i/>
-          <w:iCs/>
-          <w:sz w:val="22"/>
-          <w:szCs w:val="22"/>
-        </w:rPr>
-        <w:t xml:space="preserve">d</w:t>
-      </w:r>
-      <w:r>
-        <w:rPr>
-          <w:rFonts w:ascii="Calibri" w:cs="Calibri" w:eastAsia="Calibri" w:hAnsi="Calibri"/>
-          <w:b w:val="false"/>
-          <w:bCs w:val="false"/>
-          <w:i/>
-          <w:iCs/>
-          <w:sz w:val="22"/>
-          <w:szCs w:val="22"/>
-          <w:vertAlign w:val="subscript"/>
-        </w:rPr>
-        <w:t xml:space="preserve">t−j</w:t>
-      </w:r>
-      <w:r>
-        <w:rPr>
-          <w:rFonts w:ascii="Calibri" w:cs="Calibri" w:eastAsia="Calibri" w:hAnsi="Calibri"/>
-          <w:b w:val="false"/>
-          <w:bCs w:val="false"/>
-          <w:i w:val="false"/>
-          <w:iCs w:val="false"/>
-          <w:sz w:val="22"/>
-          <w:szCs w:val="22"/>
-        </w:rPr>
-        <w:t xml:space="preserve">  +  </w:t>
-      </w:r>
-      <w:r>
-        <w:rPr>
-          <w:rFonts w:ascii="Calibri" w:cs="Calibri" w:eastAsia="Calibri" w:hAnsi="Calibri"/>
-          <w:b w:val="false"/>
-          <w:bCs w:val="false"/>
-          <w:i/>
-          <w:iCs/>
-          <w:sz w:val="22"/>
-          <w:szCs w:val="22"/>
-        </w:rPr>
-        <w:t xml:space="preserve">ε</w:t>
-      </w:r>
-      <w:r>
-        <w:rPr>
-          <w:rFonts w:ascii="Calibri" w:cs="Calibri" w:eastAsia="Calibri" w:hAnsi="Calibri"/>
-          <w:b w:val="false"/>
-          <w:bCs w:val="false"/>
-          <w:i/>
-          <w:iCs/>
-          <w:sz w:val="22"/>
-          <w:szCs w:val="22"/>
-          <w:vertAlign w:val="subscript"/>
-        </w:rPr>
-        <w:t xml:space="preserve">t</w:t>
-      </w:r>
-    </w:p>
-    <w:p>
-      <w:pPr>
-        <w:pStyle w:val="Heading2"/>
-        <w:spacing w:after="100" w:before="240"/>
-      </w:pPr>
-      <w:r>
-        <w:rPr>
-          <w:rFonts w:ascii="Calibri" w:cs="Calibri" w:eastAsia="Calibri" w:hAnsi="Calibri"/>
-          <w:b/>
-          <w:bCs/>
-          <w:sz w:val="23"/>
-          <w:szCs w:val="23"/>
-        </w:rPr>
-        <w:t xml:space="preserve">4.4. Corrección de la endogeneidad del riesgo soberano</w:t>
-      </w:r>
-    </w:p>
-    <w:p>
-      <w:pPr>
-        <w:spacing w:after="140" w:line="300"/>
-        <w:ind w:firstLine="431"/>
-        <w:jc w:val="both"/>
-      </w:pPr>
-      <w:r>
-        <w:rPr>
-          <w:rFonts w:ascii="Calibri" w:cs="Calibri" w:eastAsia="Calibri" w:hAnsi="Calibri"/>
-          <w:b w:val="false"/>
-          <w:bCs w:val="false"/>
-          <w:i w:val="false"/>
-          <w:iCs w:val="false"/>
-          <w:sz w:val="22"/>
-          <w:szCs w:val="22"/>
-        </w:rPr>
-        <w:t xml:space="preserve">La teoría predice causalidad inversa entre el resultado fiscal y el riesgo soberano: un deterioro fiscal eleva la prima que exigen los acreedores, y una suba exógena del EMBI+ encarece el financiamiento y presiona las cuentas públicas. Se instrumenta el EMBI+ con el índice de volatilidad global VIX y un diferencial de riesgo soberano regional, y se estima por variables instrumentales en dos etapas. La fuerza del diseño se evalúa con el estadístico F de primera etapa (umbral de Staiger y Stock: mayor que 10), el test de endogeneidad de Wu-Hausman y el test de sobreidentificación de Sargan.</w:t>
-      </w:r>
-    </w:p>
-    <w:p>
-      <w:pPr>
-        <w:pStyle w:val="Heading2"/>
-        <w:spacing w:after="100" w:before="240"/>
-      </w:pPr>
-      <w:r>
-        <w:rPr>
-          <w:rFonts w:ascii="Calibri" w:cs="Calibri" w:eastAsia="Calibri" w:hAnsi="Calibri"/>
-          <w:b/>
-          <w:bCs/>
-          <w:sz w:val="23"/>
-          <w:szCs w:val="23"/>
-        </w:rPr>
-        <w:t xml:space="preserve">4.5. Modelos de umbral y fatiga fiscal</w:t>
-      </w:r>
-    </w:p>
-    <w:p>
-      <w:pPr>
-        <w:spacing w:after="140" w:line="300"/>
-        <w:ind w:firstLine="431"/>
-        <w:jc w:val="both"/>
-      </w:pPr>
-      <w:r>
-        <w:rPr>
-          <w:rFonts w:ascii="Calibri" w:cs="Calibri" w:eastAsia="Calibri" w:hAnsi="Calibri"/>
-          <w:b w:val="false"/>
-          <w:bCs w:val="false"/>
-          <w:i w:val="false"/>
-          <w:iCs w:val="false"/>
-          <w:sz w:val="22"/>
-          <w:szCs w:val="22"/>
-        </w:rPr>
-        <w:t xml:space="preserve">El contraste canónico de fatiga fiscal es el modelo de umbral de Hansen (1999), con punto de quiebre determinado por el nivel de riesgo soberano:</w:t>
-      </w:r>
-    </w:p>
-    <w:p>
-      <w:pPr>
-        <w:spacing w:after="150" w:before="110"/>
-        <w:jc w:val="center"/>
-      </w:pPr>
-      <w:r>
-        <w:rPr>
-          <w:rFonts w:ascii="Calibri" w:cs="Calibri" w:eastAsia="Calibri" w:hAnsi="Calibri"/>
-          <w:b w:val="false"/>
-          <w:bCs w:val="false"/>
-          <w:i/>
-          <w:iCs/>
-          <w:sz w:val="22"/>
-          <w:szCs w:val="22"/>
-        </w:rPr>
-        <w:t xml:space="preserve">pb</w:t>
-      </w:r>
-      <w:r>
-        <w:rPr>
-          <w:rFonts w:ascii="Calibri" w:cs="Calibri" w:eastAsia="Calibri" w:hAnsi="Calibri"/>
-          <w:b w:val="false"/>
-          <w:bCs w:val="false"/>
-          <w:i/>
-          <w:iCs/>
-          <w:sz w:val="22"/>
-          <w:szCs w:val="22"/>
-          <w:vertAlign w:val="subscript"/>
-        </w:rPr>
-        <w:t xml:space="preserve">t</w:t>
-      </w:r>
-      <w:r>
-        <w:rPr>
-          <w:rFonts w:ascii="Calibri" w:cs="Calibri" w:eastAsia="Calibri" w:hAnsi="Calibri"/>
-          <w:b w:val="false"/>
-          <w:bCs w:val="false"/>
-          <w:i w:val="false"/>
-          <w:iCs w:val="false"/>
-          <w:sz w:val="22"/>
-          <w:szCs w:val="22"/>
-        </w:rPr>
-        <w:t xml:space="preserve">  =  α  +  β</w:t>
-      </w:r>
-      <w:r>
-        <w:rPr>
-          <w:rFonts w:ascii="Calibri" w:cs="Calibri" w:eastAsia="Calibri" w:hAnsi="Calibri"/>
-          <w:b w:val="false"/>
-          <w:bCs w:val="false"/>
-          <w:i w:val="false"/>
-          <w:iCs w:val="false"/>
-          <w:sz w:val="22"/>
-          <w:szCs w:val="22"/>
-          <w:vertAlign w:val="subscript"/>
-        </w:rPr>
-        <w:t xml:space="preserve">1</w:t>
-      </w:r>
-      <w:r>
-        <w:rPr>
-          <w:rFonts w:ascii="Calibri" w:cs="Calibri" w:eastAsia="Calibri" w:hAnsi="Calibri"/>
-          <w:b w:val="false"/>
-          <w:bCs w:val="false"/>
-          <w:i w:val="false"/>
-          <w:iCs w:val="false"/>
-          <w:sz w:val="22"/>
-          <w:szCs w:val="22"/>
-        </w:rPr>
-        <w:t xml:space="preserve"> </w:t>
-      </w:r>
-      <w:r>
-        <w:rPr>
-          <w:rFonts w:ascii="Calibri" w:cs="Calibri" w:eastAsia="Calibri" w:hAnsi="Calibri"/>
-          <w:b w:val="false"/>
-          <w:bCs w:val="false"/>
-          <w:i/>
-          <w:iCs/>
-          <w:sz w:val="22"/>
-          <w:szCs w:val="22"/>
-        </w:rPr>
-        <w:t xml:space="preserve">d</w:t>
-      </w:r>
-      <w:r>
-        <w:rPr>
-          <w:rFonts w:ascii="Calibri" w:cs="Calibri" w:eastAsia="Calibri" w:hAnsi="Calibri"/>
-          <w:b w:val="false"/>
-          <w:bCs w:val="false"/>
-          <w:i/>
-          <w:iCs/>
-          <w:sz w:val="22"/>
-          <w:szCs w:val="22"/>
-          <w:vertAlign w:val="subscript"/>
-        </w:rPr>
-        <w:t xml:space="preserve">t−1</w:t>
-      </w:r>
-      <w:r>
-        <w:rPr>
-          <w:rFonts w:ascii="Calibri" w:cs="Calibri" w:eastAsia="Calibri" w:hAnsi="Calibri"/>
-          <w:b w:val="false"/>
-          <w:bCs w:val="false"/>
-          <w:i w:val="false"/>
-          <w:iCs w:val="false"/>
-          <w:sz w:val="22"/>
-          <w:szCs w:val="22"/>
-        </w:rPr>
-        <w:t xml:space="preserve"> · 1( EMBI</w:t>
-      </w:r>
-      <w:r>
-        <w:rPr>
-          <w:rFonts w:ascii="Calibri" w:cs="Calibri" w:eastAsia="Calibri" w:hAnsi="Calibri"/>
-          <w:b w:val="false"/>
-          <w:bCs w:val="false"/>
-          <w:i/>
-          <w:iCs/>
-          <w:sz w:val="22"/>
-          <w:szCs w:val="22"/>
-          <w:vertAlign w:val="subscript"/>
-        </w:rPr>
-        <w:t xml:space="preserve">t</w:t>
-      </w:r>
-      <w:r>
-        <w:rPr>
-          <w:rFonts w:ascii="Calibri" w:cs="Calibri" w:eastAsia="Calibri" w:hAnsi="Calibri"/>
-          <w:b w:val="false"/>
-          <w:bCs w:val="false"/>
-          <w:i w:val="false"/>
-          <w:iCs w:val="false"/>
-          <w:sz w:val="22"/>
-          <w:szCs w:val="22"/>
-        </w:rPr>
-        <w:t xml:space="preserve"> ≤ τ )  +  β</w:t>
-      </w:r>
-      <w:r>
-        <w:rPr>
-          <w:rFonts w:ascii="Calibri" w:cs="Calibri" w:eastAsia="Calibri" w:hAnsi="Calibri"/>
-          <w:b w:val="false"/>
-          <w:bCs w:val="false"/>
-          <w:i w:val="false"/>
-          <w:iCs w:val="false"/>
-          <w:sz w:val="22"/>
-          <w:szCs w:val="22"/>
-          <w:vertAlign w:val="subscript"/>
-        </w:rPr>
-        <w:t xml:space="preserve">2</w:t>
-      </w:r>
-      <w:r>
-        <w:rPr>
-          <w:rFonts w:ascii="Calibri" w:cs="Calibri" w:eastAsia="Calibri" w:hAnsi="Calibri"/>
-          <w:b w:val="false"/>
-          <w:bCs w:val="false"/>
-          <w:i w:val="false"/>
-          <w:iCs w:val="false"/>
-          <w:sz w:val="22"/>
-          <w:szCs w:val="22"/>
-        </w:rPr>
-        <w:t xml:space="preserve"> </w:t>
-      </w:r>
-      <w:r>
-        <w:rPr>
-          <w:rFonts w:ascii="Calibri" w:cs="Calibri" w:eastAsia="Calibri" w:hAnsi="Calibri"/>
-          <w:b w:val="false"/>
-          <w:bCs w:val="false"/>
-          <w:i/>
-          <w:iCs/>
-          <w:sz w:val="22"/>
-          <w:szCs w:val="22"/>
-        </w:rPr>
-        <w:t xml:space="preserve">d</w:t>
-      </w:r>
-      <w:r>
-        <w:rPr>
-          <w:rFonts w:ascii="Calibri" w:cs="Calibri" w:eastAsia="Calibri" w:hAnsi="Calibri"/>
-          <w:b w:val="false"/>
-          <w:bCs w:val="false"/>
-          <w:i/>
-          <w:iCs/>
-          <w:sz w:val="22"/>
-          <w:szCs w:val="22"/>
-          <w:vertAlign w:val="subscript"/>
-        </w:rPr>
-        <w:t xml:space="preserve">t−1</w:t>
-      </w:r>
-      <w:r>
-        <w:rPr>
-          <w:rFonts w:ascii="Calibri" w:cs="Calibri" w:eastAsia="Calibri" w:hAnsi="Calibri"/>
-          <w:b w:val="false"/>
-          <w:bCs w:val="false"/>
-          <w:i w:val="false"/>
-          <w:iCs w:val="false"/>
-          <w:sz w:val="22"/>
-          <w:szCs w:val="22"/>
-        </w:rPr>
-        <w:t xml:space="preserve"> · 1( EMBI</w:t>
-      </w:r>
-      <w:r>
-        <w:rPr>
-          <w:rFonts w:ascii="Calibri" w:cs="Calibri" w:eastAsia="Calibri" w:hAnsi="Calibri"/>
-          <w:b w:val="false"/>
-          <w:bCs w:val="false"/>
-          <w:i/>
-          <w:iCs/>
-          <w:sz w:val="22"/>
-          <w:szCs w:val="22"/>
-          <w:vertAlign w:val="subscript"/>
-        </w:rPr>
-        <w:t xml:space="preserve">t</w:t>
-      </w:r>
-      <w:r>
-        <w:rPr>
-          <w:rFonts w:ascii="Calibri" w:cs="Calibri" w:eastAsia="Calibri" w:hAnsi="Calibri"/>
-          <w:b w:val="false"/>
-          <w:bCs w:val="false"/>
-          <w:i w:val="false"/>
-          <w:iCs w:val="false"/>
-          <w:sz w:val="22"/>
-          <w:szCs w:val="22"/>
-        </w:rPr>
-        <w:t xml:space="preserve"> &gt; τ )  +  γ </w:t>
-      </w:r>
-      <w:r>
-        <w:rPr>
-          <w:rFonts w:ascii="Calibri" w:cs="Calibri" w:eastAsia="Calibri" w:hAnsi="Calibri"/>
-          <w:b w:val="false"/>
-          <w:bCs w:val="false"/>
-          <w:i/>
-          <w:iCs/>
-          <w:sz w:val="22"/>
-          <w:szCs w:val="22"/>
-        </w:rPr>
-        <w:t xml:space="preserve">ỹ</w:t>
-      </w:r>
-      <w:r>
-        <w:rPr>
-          <w:rFonts w:ascii="Calibri" w:cs="Calibri" w:eastAsia="Calibri" w:hAnsi="Calibri"/>
-          <w:b w:val="false"/>
-          <w:bCs w:val="false"/>
-          <w:i/>
-          <w:iCs/>
-          <w:sz w:val="22"/>
-          <w:szCs w:val="22"/>
-          <w:vertAlign w:val="subscript"/>
-        </w:rPr>
-        <w:t xml:space="preserve">t</w:t>
-      </w:r>
-      <w:r>
-        <w:rPr>
-          <w:rFonts w:ascii="Calibri" w:cs="Calibri" w:eastAsia="Calibri" w:hAnsi="Calibri"/>
-          <w:b w:val="false"/>
-          <w:bCs w:val="false"/>
-          <w:i w:val="false"/>
-          <w:iCs w:val="false"/>
-          <w:sz w:val="22"/>
-          <w:szCs w:val="22"/>
-        </w:rPr>
-        <w:t xml:space="preserve">  +  </w:t>
-      </w:r>
-      <w:r>
-        <w:rPr>
-          <w:rFonts w:ascii="Calibri" w:cs="Calibri" w:eastAsia="Calibri" w:hAnsi="Calibri"/>
-          <w:b w:val="false"/>
-          <w:bCs w:val="false"/>
-          <w:i/>
-          <w:iCs/>
-          <w:sz w:val="22"/>
-          <w:szCs w:val="22"/>
-        </w:rPr>
-        <w:t xml:space="preserve">ε</w:t>
-      </w:r>
-      <w:r>
-        <w:rPr>
-          <w:rFonts w:ascii="Calibri" w:cs="Calibri" w:eastAsia="Calibri" w:hAnsi="Calibri"/>
-          <w:b w:val="false"/>
-          <w:bCs w:val="false"/>
-          <w:i/>
-          <w:iCs/>
-          <w:sz w:val="22"/>
-          <w:szCs w:val="22"/>
-          <w:vertAlign w:val="subscript"/>
-        </w:rPr>
-        <w:t xml:space="preserve">t</w:t>
-      </w:r>
-    </w:p>
-    <w:p>
-      <w:pPr>
-        <w:spacing w:after="140" w:line="300"/>
-        <w:ind w:firstLine="431"/>
-        <w:jc w:val="both"/>
-      </w:pPr>
-      <w:r>
-        <w:rPr>
-          <w:rFonts w:ascii="Calibri" w:cs="Calibri" w:eastAsia="Calibri" w:hAnsi="Calibri"/>
-          <w:b w:val="false"/>
-          <w:bCs w:val="false"/>
-          <w:i w:val="false"/>
-          <w:iCs w:val="false"/>
-          <w:sz w:val="22"/>
-          <w:szCs w:val="22"/>
-        </w:rPr>
-        <w:t xml:space="preserve">El umbral óptimo </w:t>
-      </w:r>
-      <w:r>
-        <w:rPr>
-          <w:rFonts w:ascii="Calibri" w:cs="Calibri" w:eastAsia="Calibri" w:hAnsi="Calibri"/>
-          <w:b w:val="false"/>
-          <w:bCs w:val="false"/>
-          <w:i/>
-          <w:iCs/>
-          <w:sz w:val="22"/>
-          <w:szCs w:val="22"/>
-        </w:rPr>
-        <w:t xml:space="preserve">τ*</w:t>
-      </w:r>
-      <w:r>
-        <w:rPr>
-          <w:rFonts w:ascii="Calibri" w:cs="Calibri" w:eastAsia="Calibri" w:hAnsi="Calibri"/>
-          <w:b w:val="false"/>
-          <w:bCs w:val="false"/>
-          <w:i w:val="false"/>
-          <w:iCs w:val="false"/>
-          <w:sz w:val="22"/>
-          <w:szCs w:val="22"/>
-        </w:rPr>
-        <w:t xml:space="preserve"> se estima por mínima suma de cuadrados residuales sobre una grilla de percentiles de la distribución empírica del EMBI+. La significatividad del quiebre se contrasta con el estadístico Sup-LM, cuya distribución bajo linealidad se aproxima por remuestreo con 1.000 réplicas (Hansen, 2000). El análisis se extiende al marco multivariado con el Threshold VECM de Hansen y Seo (2002), que permite que las velocidades de ajuste del vector </w:t>
-      </w:r>
-      <w:r>
-        <w:rPr>
-          <w:rFonts w:ascii="Calibri" w:cs="Calibri" w:eastAsia="Calibri" w:hAnsi="Calibri"/>
-          <w:b w:val="false"/>
-          <w:bCs w:val="false"/>
-          <w:i/>
-          <w:iCs/>
-          <w:sz w:val="22"/>
-          <w:szCs w:val="22"/>
-        </w:rPr>
-        <w:t xml:space="preserve">α</w:t>
-      </w:r>
-      <w:r>
-        <w:rPr>
-          <w:rFonts w:ascii="Calibri" w:cs="Calibri" w:eastAsia="Calibri" w:hAnsi="Calibri"/>
-          <w:b w:val="false"/>
-          <w:bCs w:val="false"/>
-          <w:i w:val="false"/>
-          <w:iCs w:val="false"/>
-          <w:sz w:val="22"/>
-          <w:szCs w:val="22"/>
-        </w:rPr>
-        <w:t xml:space="preserve"> conmuten de régimen según el estado del mercado financiero.</w:t>
-      </w:r>
-    </w:p>
-    <w:p>
-      <w:pPr>
-        <w:pStyle w:val="Heading2"/>
-        <w:spacing w:after="100" w:before="240"/>
-      </w:pPr>
-      <w:r>
-        <w:rPr>
-          <w:rFonts w:ascii="Calibri" w:cs="Calibri" w:eastAsia="Calibri" w:hAnsi="Calibri"/>
-          <w:b/>
-          <w:bCs/>
-          <w:sz w:val="23"/>
-          <w:szCs w:val="23"/>
-        </w:rPr>
-        <w:t xml:space="preserve">4.6. Simulación estocástica y proceso CIR</w:t>
-      </w:r>
-    </w:p>
-    <w:p>
-      <w:pPr>
-        <w:spacing w:after="140" w:line="300"/>
-        <w:ind w:firstLine="431"/>
-        <w:jc w:val="both"/>
-      </w:pPr>
-      <w:r>
-        <w:rPr>
-          <w:rFonts w:ascii="Calibri" w:cs="Calibri" w:eastAsia="Calibri" w:hAnsi="Calibri"/>
-          <w:b w:val="false"/>
-          <w:bCs w:val="false"/>
-          <w:i w:val="false"/>
-          <w:iCs w:val="false"/>
-          <w:sz w:val="22"/>
-          <w:szCs w:val="22"/>
-        </w:rPr>
-        <w:t xml:space="preserve">El análisis de sostenibilidad se resuelve con una simulación de Monte Carlo de 1.000 iteraciones en la que las variables fundamentales reciben perturbaciones de una distribución t de Student multivariada con ν ≈ 4,8 grados de libertad —colas pesadas, calibradas a partir de la curtosis histórica— acopladas a correlaciones dinámicas. La tasa de refinanciación externa se dota de consistencia con la teoría de estructura temporal modelando el riesgo soberano como un proceso de difusión con reversión a la media (Cox, Ingersoll y Ross, 1985):</w:t>
-      </w:r>
-    </w:p>
-    <w:p>
-      <w:pPr>
-        <w:spacing w:after="150" w:before="110"/>
-        <w:jc w:val="center"/>
-      </w:pPr>
-      <w:r>
-        <w:rPr>
-          <w:rFonts w:ascii="Calibri" w:cs="Calibri" w:eastAsia="Calibri" w:hAnsi="Calibri"/>
-          <w:b w:val="false"/>
-          <w:bCs w:val="false"/>
-          <w:i w:val="false"/>
-          <w:iCs w:val="false"/>
-          <w:sz w:val="22"/>
-          <w:szCs w:val="22"/>
-        </w:rPr>
-        <w:t xml:space="preserve">d( risk</w:t>
-      </w:r>
-      <w:r>
-        <w:rPr>
-          <w:rFonts w:ascii="Calibri" w:cs="Calibri" w:eastAsia="Calibri" w:hAnsi="Calibri"/>
-          <w:b w:val="false"/>
-          <w:bCs w:val="false"/>
-          <w:i/>
-          <w:iCs/>
-          <w:sz w:val="22"/>
-          <w:szCs w:val="22"/>
-          <w:vertAlign w:val="subscript"/>
-        </w:rPr>
-        <w:t xml:space="preserve">t</w:t>
-      </w:r>
-      <w:r>
-        <w:rPr>
-          <w:rFonts w:ascii="Calibri" w:cs="Calibri" w:eastAsia="Calibri" w:hAnsi="Calibri"/>
-          <w:b w:val="false"/>
-          <w:bCs w:val="false"/>
-          <w:i w:val="false"/>
-          <w:iCs w:val="false"/>
-          <w:sz w:val="22"/>
-          <w:szCs w:val="22"/>
-        </w:rPr>
-        <w:t xml:space="preserve"> )  =  κ ( θ − risk</w:t>
-      </w:r>
-      <w:r>
-        <w:rPr>
-          <w:rFonts w:ascii="Calibri" w:cs="Calibri" w:eastAsia="Calibri" w:hAnsi="Calibri"/>
-          <w:b w:val="false"/>
-          <w:bCs w:val="false"/>
-          <w:i/>
-          <w:iCs/>
-          <w:sz w:val="22"/>
-          <w:szCs w:val="22"/>
-          <w:vertAlign w:val="subscript"/>
-        </w:rPr>
-        <w:t xml:space="preserve">t</w:t>
-      </w:r>
-      <w:r>
-        <w:rPr>
-          <w:rFonts w:ascii="Calibri" w:cs="Calibri" w:eastAsia="Calibri" w:hAnsi="Calibri"/>
-          <w:b w:val="false"/>
-          <w:bCs w:val="false"/>
-          <w:i w:val="false"/>
-          <w:iCs w:val="false"/>
-          <w:sz w:val="22"/>
-          <w:szCs w:val="22"/>
-        </w:rPr>
-        <w:t xml:space="preserve"> ) d</w:t>
-      </w:r>
-      <w:r>
-        <w:rPr>
-          <w:rFonts w:ascii="Calibri" w:cs="Calibri" w:eastAsia="Calibri" w:hAnsi="Calibri"/>
-          <w:b w:val="false"/>
-          <w:bCs w:val="false"/>
-          <w:i/>
-          <w:iCs/>
-          <w:sz w:val="22"/>
-          <w:szCs w:val="22"/>
-        </w:rPr>
-        <w:t xml:space="preserve">t</w:t>
-      </w:r>
-      <w:r>
-        <w:rPr>
-          <w:rFonts w:ascii="Calibri" w:cs="Calibri" w:eastAsia="Calibri" w:hAnsi="Calibri"/>
-          <w:b w:val="false"/>
-          <w:bCs w:val="false"/>
-          <w:i w:val="false"/>
-          <w:iCs w:val="false"/>
-          <w:sz w:val="22"/>
-          <w:szCs w:val="22"/>
-        </w:rPr>
-        <w:t xml:space="preserve">  +  σ √( risk</w:t>
-      </w:r>
-      <w:r>
-        <w:rPr>
-          <w:rFonts w:ascii="Calibri" w:cs="Calibri" w:eastAsia="Calibri" w:hAnsi="Calibri"/>
-          <w:b w:val="false"/>
-          <w:bCs w:val="false"/>
-          <w:i/>
-          <w:iCs/>
-          <w:sz w:val="22"/>
-          <w:szCs w:val="22"/>
-          <w:vertAlign w:val="subscript"/>
-        </w:rPr>
-        <w:t xml:space="preserve">t</w:t>
-      </w:r>
-      <w:r>
-        <w:rPr>
-          <w:rFonts w:ascii="Calibri" w:cs="Calibri" w:eastAsia="Calibri" w:hAnsi="Calibri"/>
-          <w:b w:val="false"/>
-          <w:bCs w:val="false"/>
-          <w:i w:val="false"/>
-          <w:iCs w:val="false"/>
-          <w:sz w:val="22"/>
-          <w:szCs w:val="22"/>
-        </w:rPr>
-        <w:t xml:space="preserve"> ) d</w:t>
-      </w:r>
-      <w:r>
-        <w:rPr>
-          <w:rFonts w:ascii="Calibri" w:cs="Calibri" w:eastAsia="Calibri" w:hAnsi="Calibri"/>
-          <w:b w:val="false"/>
-          <w:bCs w:val="false"/>
-          <w:i/>
-          <w:iCs/>
-          <w:sz w:val="22"/>
-          <w:szCs w:val="22"/>
-        </w:rPr>
-        <w:t xml:space="preserve">W</w:t>
-      </w:r>
-      <w:r>
-        <w:rPr>
-          <w:rFonts w:ascii="Calibri" w:cs="Calibri" w:eastAsia="Calibri" w:hAnsi="Calibri"/>
-          <w:b w:val="false"/>
-          <w:bCs w:val="false"/>
-          <w:i/>
-          <w:iCs/>
-          <w:sz w:val="22"/>
-          <w:szCs w:val="22"/>
-          <w:vertAlign w:val="subscript"/>
-        </w:rPr>
-        <w:t xml:space="preserve">t</w:t>
+        <w:drawing>
+          <wp:inline distT="0" distB="0" distL="0" distR="0">
+            <wp:extent cx="5715000" cy="514350"/>
+            <wp:effectExtent t="0" r="0" b="0" l="0"/>
+            <wp:docPr id="1" name="" descr="" title=""/>
+            <wp:cNvGraphicFramePr>
+              <a:graphicFrameLocks xmlns:a="http://schemas.openxmlformats.org/drawingml/2006/main" noChangeAspect="1"/>
+            </wp:cNvGraphicFramePr>
+            <a:graphic xmlns:a="http://schemas.openxmlformats.org/drawingml/2006/main">
+              <a:graphicData uri="http://schemas.openxmlformats.org/drawingml/2006/picture">
+                <pic:pic xmlns:pic="http://schemas.openxmlformats.org/drawingml/2006/picture">
+                  <pic:nvPicPr>
+                    <pic:cNvPr id="0" name="" descr=""/>
+                    <pic:cNvPicPr>
+                      <a:picLocks noChangeAspect="1" noChangeArrowheads="1"/>
+                    </pic:cNvPicPr>
+                  </pic:nvPicPr>
+                  <pic:blipFill>
+                    <a:blip r:embed="rId16" cstate="none"/>
+                    <a:srcRect/>
+                    <a:stretch>
+                      <a:fillRect/>
+                    </a:stretch>
+                  </pic:blipFill>
+                  <pic:spPr bwMode="auto">
+                    <a:xfrm>
+                      <a:off x="0" y="0"/>
+                      <a:ext cx="5715000" cy="514350"/>
+                    </a:xfrm>
+                    <a:prstGeom prst="rect">
+                      <a:avLst/>
+                    </a:prstGeom>
+                  </pic:spPr>
+                </pic:pic>
+              </a:graphicData>
+            </a:graphic>
+          </wp:inline>
+        </w:drawing>
       </w:r>
     </w:p>
     <w:p>

</xml_diff>